<commit_message>
research: Rulings Sheet III corrected — the 16 September intake (Wolin, Crouch 2004, Bean, Major, Youings, Holman, Leseur, Perroy, Tilly 1975) folded in; Decisions 1, 8, 10–12 rewritten on the actual evidence (coinage check completed; dissolution a stock not a flow; ratchet in Finer; 1468 Estates confirmed, 1451 hinge); Decisions 29–32 added (Cadillac per Leseur; Belloc per Holman; Perroy's accounts; Finer/Brandenburg); 32 decisions
Co-Authored-By: Claude Fable 5.1 <noreply@anthropic.com>
Claude-Session: https://claude.ai/code/session_01H5rrR5vkFS2qNnMCtm1fKE
</commit_message>
<xml_diff>
--- a/research/Rulings-Sheet-III-2026-09-29.docx
+++ b/research/Rulings-Sheet-III-2026-09-29.docx
@@ -59,7 +59,7 @@
           <w:sz w:val="21"/>
           <w:szCs w:val="21"/>
         </w:rPr>
-        <w:t xml:space="preserve">Prepared for Roderick Jones, 29 September 2026. Twenty-eight decisions, consolidated from seventy-four items raised by the reading of 13–29 September, including Jill Lepore, The Rise and Fall of the Artificial State.</w:t>
+        <w:t xml:space="preserve">Prepared for Roderick Jones, 29 September 2026. Thirty-two decisions, consolidated from more than a hundred items raised by the reading of 13–29 September — including the 16 September intake (Wolin, Bean, Major, Youings, Holman, Leseur, Perroy, Tilly 1975) and Jill Lepore, The Rise and Fall of the Artificial State.</w:t>
       </w:r>
     </w:p>
     <w:p>
@@ -102,20 +102,20 @@
           <w:sz w:val="22"/>
           <w:szCs w:val="22"/>
         </w:rPr>
-        <w:t xml:space="preserve">Since 13 September, seventy new works have been read against the drafts: the September monographs, the contemporary rivals and primaries, the Burgundian and French chronicles, and most recently Jill Lepore's book on the artificial state. Every one has been assessed, entered in the relevant chapter's sources and memo, and its objections logged in the chapter's critique file. None of that reading has been allowed to touch a draft, because the rule is that nothing changes in the text until you have ruled. That is why this document exists.</w:t>
-      </w:r>
-    </w:p>
-    <w:p>
-      <w:pPr>
-        <w:spacing w:after="150" w:line="290"/>
-      </w:pPr>
-      <w:r>
-        <w:rPr>
-          <w:rFonts w:ascii="Georgia" w:cs="Georgia" w:eastAsia="Georgia" w:hAnsi="Georgia"/>
-          <w:sz w:val="22"/>
-          <w:szCs w:val="22"/>
-        </w:rPr>
-        <w:t xml:space="preserve">The decisions that follow are the residue of that reading. In their raw form there were seventy-four of them, written as a spreadsheet in specialist shorthand. Here they have been consolidated into twenty-eight, grouped by subject, and written out in ordinary language with the background, the stakes and the consequences of each direction. Some of the twenty-eight are large — three would change what the book argues; several would change how it argues. Many are small. Each says which it is.</w:t>
+        <w:t xml:space="preserve">Since 13 September, more than eighty new works have been read against the drafts: the September monographs; the contemporary rivals and primaries; a 16 September intake that brought in the load-bearing retrievals the earlier reading had asked for — Wolin, Crouch's 2004 book, Bean, Major, Youings, Holman, Leseur, Perroy and the full Tilly 1975 volume; the Burgundian and French chronicles; and most recently Jill Lepore's book on the artificial state. Every one has been assessed, entered in the relevant chapter's sources and memo, and its objections logged in the chapter's critique file. None of that reading has been allowed to touch a draft, because the rule is that nothing changes in the text until you have ruled. That is why this document exists.</w:t>
+      </w:r>
+    </w:p>
+    <w:p>
+      <w:pPr>
+        <w:spacing w:after="150" w:line="290"/>
+      </w:pPr>
+      <w:r>
+        <w:rPr>
+          <w:rFonts w:ascii="Georgia" w:cs="Georgia" w:eastAsia="Georgia" w:hAnsi="Georgia"/>
+          <w:sz w:val="22"/>
+          <w:szCs w:val="22"/>
+        </w:rPr>
+        <w:t xml:space="preserve">The decisions that follow are the residue of that reading. In their raw form there were well over a hundred of them — seventy-four on the spreadsheet in specialist shorthand, and some forty more lettered at the foot of chapter memos by the 16 September intake and never brought onto the sheet at all. Here they have been consolidated into thirty-two, grouped by subject, and written out in ordinary language with the background, the stakes and the consequences of each direction. Some of the thirty-two are large — three would change what the book argues; several would change how it argues. Many are small. Each says which it is.</w:t>
       </w:r>
     </w:p>
     <w:p>
@@ -184,7 +184,7 @@
           <w:sz w:val="22"/>
           <w:szCs w:val="22"/>
         </w:rPr>
-        <w:t xml:space="preserve">There is a summary table at the very end where you can write the twenty-eight answers in one place if you prefer.</w:t>
+        <w:t xml:space="preserve">There is a summary table at the very end where you can write all the answers in one place if you prefer.</w:t>
       </w:r>
     </w:p>
     <w:p>
@@ -214,20 +214,20 @@
           <w:sz w:val="22"/>
           <w:szCs w:val="22"/>
         </w:rPr>
-        <w:t xml:space="preserve">The first six concern the ending of the book and the claim you added a fortnight ago — what the settlement looks like if it is ornamentally democratic, whose idea that is, where in chapter 12 it is allowed to live, and two concessions the Lepore reading forces. The seventh is the largest single change on the sheet: whether the book must say that half of the reassertion it predicts has already happened. Decisions 8 and 9 are England. Decisions 10 to 14 are the mechanism itself — what the ratchet is, whether Tilly rejected the artillery thesis rather than ignoring it, whether the French settlement was a tax settlement or a credit one, and what "administrative capacity" means. Decisions 15 and 16 are Spain and China. Decisions 17 to 20 are words the book has borrowed without paying for them — "exclusive", "legibility", the answer to Ruggie, and a set of smaller terms. Decisions 21 to 24 are the new medieval scenes from Chastellain and Commynes, and the housekeeping that came with them. Decisions 25 and 26 are chapter 9 and Bagehot. Decisions 27 and 28 are the forecast and how it is scored.</w:t>
-      </w:r>
-    </w:p>
-    <w:p>
-      <w:pPr>
-        <w:spacing w:after="150" w:line="290"/>
-      </w:pPr>
-      <w:r>
-        <w:rPr>
-          <w:rFonts w:ascii="Georgia" w:cs="Georgia" w:eastAsia="Georgia" w:hAnsi="Georgia"/>
-          <w:sz w:val="22"/>
-          <w:szCs w:val="22"/>
-        </w:rPr>
-        <w:t xml:space="preserve">If you have an hour, do 1, 2, 7, 8, 10, 12, 16 and 25. If you have an afternoon, do them all.</w:t>
+        <w:t xml:space="preserve">The first six concern the ending of the book and the claim you added a fortnight ago — what the settlement looks like if it is ornamentally democratic, whose idea that is, where in chapter 12 it is allowed to live, and two concessions the Lepore reading forces. The seventh is the largest single change on the sheet: whether the book must say that half of the reassertion it predicts has already happened. Decisions 8 and 9 are England. Decisions 10 to 14 are the mechanism itself — what the ratchet is and how much of it Finer and Bean already had, whether the French settlement was a tax settlement or a credit one and whether its founding date is 1439 or 1451, and what "administrative capacity" means. Decisions 15 and 16 are Spain and China. Decisions 17 to 20 are words the book has borrowed without paying for them — "exclusive", "legibility", the answer to Ruggie, and a set of smaller terms. Decisions 21 to 24 are the new medieval scenes from Chastellain and Commynes, and the housekeeping that came with them. Decisions 25 and 26 are chapter 9 and Bagehot. Decisions 27 and 28 are the forecast and how it is scored. Decisions 29 to 32 carry out two rulings you have already made — resolve Cadillac, and cite Belloc for the syndrome — now that the sources for them have been read, plus two sets of account-book corrections.</w:t>
+      </w:r>
+    </w:p>
+    <w:p>
+      <w:pPr>
+        <w:spacing w:after="150" w:line="290"/>
+      </w:pPr>
+      <w:r>
+        <w:rPr>
+          <w:rFonts w:ascii="Georgia" w:cs="Georgia" w:eastAsia="Georgia" w:hAnsi="Georgia"/>
+          <w:sz w:val="22"/>
+          <w:szCs w:val="22"/>
+        </w:rPr>
+        <w:t xml:space="preserve">If you have an hour, do 1, 2, 7, 8, 10, 12, 16 and 25 — 12 in particular, because a sentence in the spine does not survive it. If you have an afternoon, do them all.</w:t>
       </w:r>
     </w:p>
     <w:p>
@@ -278,7 +278,7 @@
           <w:sz w:val="19"/>
           <w:szCs w:val="19"/>
         </w:rPr>
-        <w:t xml:space="preserve">Covers rows: (mm), (oooo), (llll) and Check 6</w:t>
+        <w:t xml:space="preserve">Covers rows: (mm), (oooo), (llll), Check 6, and ch12 memo Revisions 29–30 (the Wolin and Crouch 2004 intake of 16 September)</w:t>
       </w:r>
     </w:p>
     <w:p>
@@ -301,20 +301,7 @@
           <w:sz w:val="22"/>
           <w:szCs w:val="22"/>
         </w:rPr>
-        <w:t xml:space="preserve"> Two weeks ago you ruled that the democratic bloc may end up "ornamentally democratic", and the phrase "ornamental democracy" is proposed as chapter 12's one coined term, with the Coda using it again. Your own voice rule, added on 1 August, says that before the chapter's footer (the short ledger at the end of each draft recording what the chapter coined) claims a term as a coinage, someone must check whether an existing scholar already owns it. That check has now been run against three books, and the results decide both whether you may claim the phrase and how you must introduce it.</w:t>
-      </w:r>
-    </w:p>
-    <w:p>
-      <w:pPr>
-        <w:spacing w:after="150" w:line="290"/>
-      </w:pPr>
-      <w:r>
-        <w:rPr>
-          <w:rFonts w:ascii="Georgia" w:cs="Georgia" w:eastAsia="Georgia" w:hAnsi="Georgia"/>
-          <w:sz w:val="22"/>
-          <w:szCs w:val="22"/>
-        </w:rPr>
-        <w:t xml:space="preserve">The first predecessor is Colin Crouch, a British political sociologist, in the Fabian Society pamphlet </w:t>
+        <w:t xml:space="preserve"> Two weeks ago you ruled that the democratic bloc may end up "ornamentally democratic", and the phrase "ornamental democracy" is proposed as chapter 12's one coined term, with the Coda using it again. Your own voice rule, added on 1 August, says that before the chapter's footer (the short ledger at the end of each draft recording what the chapter coined) claims a term as a coinage, someone must check whether an existing scholar already owns it. That check has now been run against four books, and it is complete. The earlier version of this decision said that Sheldon Wolin's </w:t>
       </w:r>
       <w:r>
         <w:rPr>
@@ -324,15 +311,28 @@
           <w:sz w:val="22"/>
           <w:szCs w:val="22"/>
         </w:rPr>
-        <w:t xml:space="preserve">Coping with Post-Democracy</w:t>
-      </w:r>
-      <w:r>
-        <w:rPr>
-          <w:rFonts w:ascii="Georgia" w:cs="Georgia" w:eastAsia="Georgia" w:hAnsi="Georgia"/>
-          <w:sz w:val="22"/>
-          <w:szCs w:val="22"/>
-        </w:rPr>
-        <w:t xml:space="preserve"> (2000; the corpus holds the pamphlet, not the 2004 book). His condition is yours in outline, twenty-five years early: "while the forms of democracy remain fully in place - and today in some respects are actually strengthened - politics and government are increasingly slipping back into the control of privileged elites" (Crouch, PDF p. 2), and "it is difficult to dignify it as democracy itself" (PDF p. 8). But his word sweep is clean: no "ornament", "ornamental", "façade", "hollow", "husk", "veneer" or "decorat-". The adjective itself comes from Walter Bagehot's </w:t>
+        <w:t xml:space="preserve">Democracy Incorporated</w:t>
+      </w:r>
+      <w:r>
+        <w:rPr>
+          <w:rFonts w:ascii="Georgia" w:cs="Georgia" w:eastAsia="Georgia" w:hAnsi="Georgia"/>
+          <w:sz w:val="22"/>
+          <w:szCs w:val="22"/>
+        </w:rPr>
+        <w:t xml:space="preserve"> had not been read and that the check against him was still open. That was wrong: he was read in full on 16 September, and the check was made at the page. What follows corrects the record.</w:t>
+      </w:r>
+    </w:p>
+    <w:p>
+      <w:pPr>
+        <w:spacing w:after="150" w:line="290"/>
+      </w:pPr>
+      <w:r>
+        <w:rPr>
+          <w:rFonts w:ascii="Georgia" w:cs="Georgia" w:eastAsia="Georgia" w:hAnsi="Georgia"/>
+          <w:sz w:val="22"/>
+          <w:szCs w:val="22"/>
+        </w:rPr>
+        <w:t xml:space="preserve">The first predecessor is Colin Crouch, a British political sociologist. The corpus now holds two statements of his argument: the Fabian Society pamphlet </w:t>
       </w:r>
       <w:r>
         <w:rPr>
@@ -342,15 +342,15 @@
           <w:sz w:val="22"/>
           <w:szCs w:val="22"/>
         </w:rPr>
-        <w:t xml:space="preserve">The English Constitution</w:t>
-      </w:r>
-      <w:r>
-        <w:rPr>
-          <w:rFonts w:ascii="Georgia" w:cs="Georgia" w:eastAsia="Georgia" w:hAnsi="Georgia"/>
-          <w:sz w:val="22"/>
-          <w:szCs w:val="22"/>
-        </w:rPr>
-        <w:t xml:space="preserve"> (1867), from which you already borrow the split between the "dignified" parts of a constitution (the ones people revere) and the "efficient" parts (the ones that actually govern). Bagehot uses "ornamental" exactly twice, in one passage, of the dignified parts as "the additional and solely-ornamental wheels introduced into the clocks of the Middle Ages" (Bagehot, PDF p. 83), never of a constitution or of democracy. He also held the separation of reverence from rule to be a good thing and England's glory, which you do not. The second predecessor, Sheldon Wolin's </w:t>
+        <w:t xml:space="preserve">Coping with Post-Democracy</w:t>
+      </w:r>
+      <w:r>
+        <w:rPr>
+          <w:rFonts w:ascii="Georgia" w:cs="Georgia" w:eastAsia="Georgia" w:hAnsi="Georgia"/>
+          <w:sz w:val="22"/>
+          <w:szCs w:val="22"/>
+        </w:rPr>
+        <w:t xml:space="preserve"> (2000), read in full, and the book </w:t>
       </w:r>
       <w:r>
         <w:rPr>
@@ -360,28 +360,15 @@
           <w:sz w:val="22"/>
           <w:szCs w:val="22"/>
         </w:rPr>
-        <w:t xml:space="preserve">Democracy Incorporated</w:t>
-      </w:r>
-      <w:r>
-        <w:rPr>
-          <w:rFonts w:ascii="Georgia" w:cs="Georgia" w:eastAsia="Georgia" w:hAnsi="Georgia"/>
-          <w:sz w:val="22"/>
-          <w:szCs w:val="22"/>
-        </w:rPr>
-        <w:t xml:space="preserve"> (2008), is still not in the corpus; the check against him has not been made and cannot be made from memory.</w:t>
-      </w:r>
-    </w:p>
-    <w:p>
-      <w:pPr>
-        <w:spacing w:after="150" w:line="290"/>
-      </w:pPr>
-      <w:r>
-        <w:rPr>
-          <w:rFonts w:ascii="Georgia" w:cs="Georgia" w:eastAsia="Georgia" w:hAnsi="Georgia"/>
-          <w:sz w:val="22"/>
-          <w:szCs w:val="22"/>
-        </w:rPr>
-        <w:t xml:space="preserve">The third predecessor is new. Jill Lepore, the Harvard historian, in </w:t>
+        <w:t xml:space="preserve">Post-Democracy</w:t>
+      </w:r>
+      <w:r>
+        <w:rPr>
+          <w:rFonts w:ascii="Georgia" w:cs="Georgia" w:eastAsia="Georgia" w:hAnsi="Georgia"/>
+          <w:sz w:val="22"/>
+          <w:szCs w:val="22"/>
+        </w:rPr>
+        <w:t xml:space="preserve"> (Polity, 2004), which arrived on 16 September as a partial photocopy of about fifty-five of its hundred and twenty-seven pages (chapter 1 complete; most of chapter 2, "The Global Firm", and all of chapters 5 and 6 missing). His condition is yours in outline, twenty-five years early: "while the forms of democracy remain fully in place — and today in some respects are actually strengthened — politics and government are increasingly slipping back into the control of privileged elites" (Crouch 2004, p. 6), "Virtually all the formal components of democracy survive within post-democracy" (p. 22), and yet "it is difficult to dignify it as democracy itself" (p. 21). Every quotation chapter 12 took from the pamphlet is confirmed at a printed page of the book except two, which survive only in the pamphlet and must be labelled as such. His word sweep is clean in both texts: no "ornament", "ornamental", "façade", "hollow", "husk", "veneer", "shell" or "decorative"; his words are "spectacle", "forms", "formal components", "entropy" and "parabola". The adjective itself comes from Walter Bagehot's </w:t>
       </w:r>
       <w:r>
         <w:rPr>
@@ -391,87 +378,28 @@
           <w:sz w:val="22"/>
           <w:szCs w:val="22"/>
         </w:rPr>
-        <w:t xml:space="preserve">The Rise and Fall of the Artificial State</w:t>
-      </w:r>
-      <w:r>
-        <w:rPr>
-          <w:rFonts w:ascii="Georgia" w:cs="Georgia" w:eastAsia="Georgia" w:hAnsi="Georgia"/>
-          <w:sz w:val="22"/>
-          <w:szCs w:val="22"/>
-        </w:rPr>
-        <w:t xml:space="preserve"> (a phone-scanned copy with no title or copyright page, so no publisher or year may be cited and every page number is provisional). A search of all 306 pages found "ornament", "ornamental", "façade", "hollow", "husk", "decorative", "charade" and "sham" nowhere. The nearest hits are "trappings" (of religion, on a damaged page), "veneer" (of Nick Bostrom's prose) and one "figurehead", which is her summary of Douglas Adams's Zaphod Beeblebrox, "a mere figurehead, chosen not by voters but by the government to serve as a diversion from its criminality" (Lepore, printed p. 210 / PDF p. 224). Her own concept is "government without consent" (printed p. 5 / PDF p. 15), which asks whether the governed chose; yours asks whether the elected institutions control the state's strategic commitments, which is a different test and compatible with perfectly genuine elections.</w:t>
-      </w:r>
-    </w:p>
-    <w:p>
-      <w:pPr>
-        <w:spacing w:after="150" w:line="290"/>
-      </w:pPr>
-      <w:r>
-        <w:rPr>
-          <w:rFonts w:ascii="Georgia" w:cs="Georgia" w:eastAsia="Georgia" w:hAnsi="Georgia"/>
-          <w:sz w:val="22"/>
-          <w:szCs w:val="22"/>
-        </w:rPr>
-        <w:t xml:space="preserve">There is a complication in her title. Her "artificial state" is "less a state than a dream of being without one" (printed p. xv / PDF p. 7), and her direction of travel is the opposite of yours: "Democracy and the liberal nation-state had to be abolished to free corporations from the restraining force of any government" (printed p. 205 / PDF p. 219). Searches for "foundry", "TSMC", "Anduril", "Starlink", "Pentagon", "procurement", "licensing" and "subsidy" all return zero. Two books share a phrase and mean opposite things by it: hers is corporations dissolving the state, yours is the state absorbing the corporations.</w:t>
-      </w:r>
-    </w:p>
-    <w:p>
-      <w:pPr>
-        <w:spacing w:after="150" w:line="290"/>
-      </w:pPr>
-      <w:r>
-        <w:rPr>
-          <w:rFonts w:ascii="Georgia" w:cs="Georgia" w:eastAsia="Georgia" w:hAnsi="Georgia"/>
-          <w:b/>
-          <w:bCs/>
-          <w:sz w:val="22"/>
-          <w:szCs w:val="22"/>
-        </w:rPr>
-        <w:t xml:space="preserve">Why it matters.</w:t>
-      </w:r>
-      <w:r>
-        <w:rPr>
-          <w:rFonts w:ascii="Georgia" w:cs="Georgia" w:eastAsia="Georgia" w:hAnsi="Georgia"/>
-          <w:sz w:val="22"/>
-          <w:szCs w:val="22"/>
-        </w:rPr>
-        <w:t xml:space="preserve"> This is a question of originality first and accuracy second, and it is a large one because it sits at the book's rhetorical climax. A hostile reviewer who knows the post-democracy literature will treat an unattributed "ornamental democracy" as Crouch rebranded with an adjective Bagehot used of clock wheels, and will discount the rest of Part III's ending accordingly. A reviewer who has read Lepore will assume you borrowed "artificial state" from her, or that she supports you, unless you say otherwise. What is genuinely yours is narrow and defensible: the object (control of strategic commitments, not policy in general), the falsifiers in Appendix C, and the reversed direction (the state compelled to absorb the stack, not drained by it).</w:t>
-      </w:r>
-    </w:p>
-    <w:p>
-      <w:pPr>
-        <w:spacing w:after="150" w:line="290"/>
-      </w:pPr>
-      <w:r>
-        <w:rPr>
-          <w:rFonts w:ascii="Georgia" w:cs="Georgia" w:eastAsia="Georgia" w:hAnsi="Georgia"/>
-          <w:b/>
-          <w:bCs/>
-          <w:sz w:val="22"/>
-          <w:szCs w:val="22"/>
-        </w:rPr>
-        <w:t xml:space="preserve">Your choices.</w:t>
-      </w:r>
-      <w:r>
-        <w:rPr>
-          <w:rFonts w:ascii="Georgia" w:cs="Georgia" w:eastAsia="Georgia" w:hAnsi="Georgia"/>
-          <w:sz w:val="22"/>
-          <w:szCs w:val="22"/>
-        </w:rPr>
-        <w:t xml:space="preserve"> Choice A is the full package: at first use in chapter 12 you introduce the term in the same breath as its pedigree. One clause names three predecessors with three objects (Crouch: egalitarian policy; Wolin: the regime; Lepore: consent) and the book's fourth (control of the state's strategic commitments); a second sentence names Bagehot for the adjective and refuses his valuation; a third says plainly that Lepore's "artificial state" means the opposite thing, so the collision is disposed of once and never becomes a digression. The footer ledger claims the coinage, but conditionally on Wolin until he has been read in text. This costs perhaps 250 to 350 words at the ending's most loaded point, and a Wolin retrieval before the ledger line becomes unconditional. It buys a reviewer who sees command of the field rather than evasion of it.</w:t>
-      </w:r>
-    </w:p>
-    <w:p>
-      <w:pPr>
-        <w:spacing w:after="150" w:line="290"/>
-      </w:pPr>
-      <w:r>
-        <w:rPr>
-          <w:rFonts w:ascii="Georgia" w:cs="Georgia" w:eastAsia="Georgia" w:hAnsi="Georgia"/>
-          <w:sz w:val="22"/>
-          <w:szCs w:val="22"/>
-        </w:rPr>
-        <w:t xml:space="preserve">Choice B is the bare coinage: you introduce "ornamental democracy" as your own term with no genealogy and no mention of Lepore, on the ground that an ending should not stall to pay debts. It reads cleaner and costs nothing in words. It buys a reviewer who says, correctly, that you renamed post-democracy, and who wonders why a book called </w:t>
+        <w:t xml:space="preserve">The English Constitution</w:t>
+      </w:r>
+      <w:r>
+        <w:rPr>
+          <w:rFonts w:ascii="Georgia" w:cs="Georgia" w:eastAsia="Georgia" w:hAnsi="Georgia"/>
+          <w:sz w:val="22"/>
+          <w:szCs w:val="22"/>
+        </w:rPr>
+        <w:t xml:space="preserve"> (1867), from which you already borrow the split between the "dignified" parts of a constitution (the ones people revere) and the "efficient" parts (the ones that govern). Bagehot uses "ornamental" exactly twice, in one passage, of "the additional and solely-ornamental wheels introduced into the clocks of the Middle Ages" (Bagehot, PDF p. 83), never of a constitution or of democracy, and he thought the separation of reverence from rule a good thing, which you do not.</w:t>
+      </w:r>
+    </w:p>
+    <w:p>
+      <w:pPr>
+        <w:spacing w:after="150" w:line="290"/>
+      </w:pPr>
+      <w:r>
+        <w:rPr>
+          <w:rFonts w:ascii="Georgia" w:cs="Georgia" w:eastAsia="Georgia" w:hAnsi="Georgia"/>
+          <w:sz w:val="22"/>
+          <w:szCs w:val="22"/>
+        </w:rPr>
+        <w:t xml:space="preserve">The second predecessor is Wolin, the Princeton political theorist, in </w:t>
       </w:r>
       <w:r>
         <w:rPr>
@@ -481,41 +409,144 @@
           <w:sz w:val="22"/>
           <w:szCs w:val="22"/>
         </w:rPr>
-        <w:t xml:space="preserve">The Artillery State</w:t>
-      </w:r>
-      <w:r>
-        <w:rPr>
-          <w:rFonts w:ascii="Georgia" w:cs="Georgia" w:eastAsia="Georgia" w:hAnsi="Georgia"/>
-          <w:sz w:val="22"/>
-          <w:szCs w:val="22"/>
-        </w:rPr>
-        <w:t xml:space="preserve"> never mentions the other 2026 book about an artificial state.</w:t>
-      </w:r>
-    </w:p>
-    <w:p>
-      <w:pPr>
-        <w:spacing w:after="150" w:line="290"/>
-      </w:pPr>
-      <w:r>
-        <w:rPr>
-          <w:rFonts w:ascii="Georgia" w:cs="Georgia" w:eastAsia="Georgia" w:hAnsi="Georgia"/>
-          <w:sz w:val="22"/>
-          <w:szCs w:val="22"/>
-        </w:rPr>
-        <w:t xml:space="preserve">Choice C is to drop the term: the ending says "post-democracy, restricted to strategic commitments", the title collision is still stated once, and the chapter's one coinage is spent elsewhere. This costs the sharpest label in Part III and some of the close's force; it buys complete safety on originality. A reviewer would call the book honest and slightly flat.</w:t>
-      </w:r>
-    </w:p>
-    <w:p>
-      <w:pPr>
-        <w:spacing w:after="150" w:line="290"/>
-      </w:pPr>
-      <w:r>
-        <w:rPr>
-          <w:rFonts w:ascii="Georgia" w:cs="Georgia" w:eastAsia="Georgia" w:hAnsi="Georgia"/>
-          <w:sz w:val="22"/>
-          <w:szCs w:val="22"/>
-        </w:rPr>
-        <w:t xml:space="preserve">There is one sub-choice inside A. The Lepore intake wants the whole predecessor clause to sit in chapter 12 §VII; Decision 2 below may move the constitutional close to a different section. Wherever the close lands, the predecessor clause and the collision sentence go with it.</w:t>
+        <w:t xml:space="preserve">Democracy Incorporated: Managed Democracy and the Specter of Inverted Totalitarianism</w:t>
+      </w:r>
+      <w:r>
+        <w:rPr>
+          <w:rFonts w:ascii="Georgia" w:cs="Georgia" w:eastAsia="Georgia" w:hAnsi="Georgia"/>
+          <w:sz w:val="22"/>
+          <w:szCs w:val="22"/>
+        </w:rPr>
+        <w:t xml:space="preserve"> (2008). A search of all 375 pages found "ornament", "ornamental", "façade", "veneer", "husk" and "decorative" nowhere. For honesty the near-misses are recorded: "charade" and "shell game" of one 2006 legislative episode (pp. 77–78); "hollowed out" of the English monarchy, not of democracy (p. 96); "ceremonial figurehead" of kingship (p. 97); and one genuine near-hit, "Democratic legitimation might be defined as the ceremonial and symbolic action whereby citizens invest power with authority" (p. 147). His own phrases are "managed democracy", "a political form in which governments are legitimated by elections that they have learned to control" (p. 47), "dissociated democracy", in which "the people reigned but did not rule" (pp. 228–29), "a rhetorical democracy" (p. 218) and "a bogus political democracy" (p. 273). More important than the words is the object. His is a regime type, "a new type of political system" (p. 44), covering the economy, culture, religion and the press, corporate and cultural in its mechanism, and offered by him as "tentative, hypothetical" (p. xvi) with no test by which it could be shown false. Yours is a measurable relation, confined to the state's strategic commitments and the decisive stack, with four published falsifiers in Appendix C, arising from a fiscal-military mechanism. A bloc could score ornamental on your test while his other indices improved, and democratic on yours while remaining, on his account, inverted-totalitarian. He is a rival diagnosis of the same symptoms, not the owner of the term. He also supplies, in his own vocabulary, two things the chapter can use: the restriction to strategic commitments, "the most substantial element of state power is removed from public debate" (p. 199), and a word for absorption by alliance, "predomination — that is, rule by diverse powers which have found it in their interests to combine while retaining their separate identities" (p. 185).</w:t>
+      </w:r>
+    </w:p>
+    <w:p>
+      <w:pPr>
+        <w:spacing w:after="150" w:line="290"/>
+      </w:pPr>
+      <w:r>
+        <w:rPr>
+          <w:rFonts w:ascii="Georgia" w:cs="Georgia" w:eastAsia="Georgia" w:hAnsi="Georgia"/>
+          <w:sz w:val="22"/>
+          <w:szCs w:val="22"/>
+        </w:rPr>
+        <w:t xml:space="preserve">The third predecessor is Jill Lepore, the Harvard historian, in </w:t>
+      </w:r>
+      <w:r>
+        <w:rPr>
+          <w:rFonts w:ascii="Georgia" w:cs="Georgia" w:eastAsia="Georgia" w:hAnsi="Georgia"/>
+          <w:i/>
+          <w:iCs/>
+          <w:sz w:val="22"/>
+          <w:szCs w:val="22"/>
+        </w:rPr>
+        <w:t xml:space="preserve">The Rise and Fall of the Artificial State</w:t>
+      </w:r>
+      <w:r>
+        <w:rPr>
+          <w:rFonts w:ascii="Georgia" w:cs="Georgia" w:eastAsia="Georgia" w:hAnsi="Georgia"/>
+          <w:sz w:val="22"/>
+          <w:szCs w:val="22"/>
+        </w:rPr>
+        <w:t xml:space="preserve"> (a phone-scanned copy with no title or copyright page, so no publisher or year may be cited and every page number is provisional). A search of all 306 pages found "ornament", "ornamental", "façade", "hollow", "husk", "decorative", "charade" and "sham" nowhere; the nearest hits are "trappings" (of religion), "veneer" (of Nick Bostrom's prose) and one "figurehead", her summary of Douglas Adams's Zaphod Beeblebrox (printed p. 210 / PDF p. 224). Her concept is "government without consent" (printed p. 5 / PDF p. 15), which asks whether the governed chose; yours asks whether elected institutions control the state's strategic commitments, a different test and compatible with genuine elections. Her "artificial state" runs the opposite way to yours: "Democracy and the liberal nation-state had to be abolished to free corporations from the restraining force of any government" (printed p. 205 / PDF p. 219), corporations dissolving the state where your state absorbs the corporations. The Lepore check of 28 September was the third run of the ledger and it re-confirmed what the 16 September run found.</w:t>
+      </w:r>
+    </w:p>
+    <w:p>
+      <w:pPr>
+        <w:spacing w:after="150" w:line="290"/>
+      </w:pPr>
+      <w:r>
+        <w:rPr>
+          <w:rFonts w:ascii="Georgia" w:cs="Georgia" w:eastAsia="Georgia" w:hAnsi="Georgia"/>
+          <w:b/>
+          <w:bCs/>
+          <w:sz w:val="22"/>
+          <w:szCs w:val="22"/>
+        </w:rPr>
+        <w:t xml:space="preserve">Why it matters.</w:t>
+      </w:r>
+      <w:r>
+        <w:rPr>
+          <w:rFonts w:ascii="Georgia" w:cs="Georgia" w:eastAsia="Georgia" w:hAnsi="Georgia"/>
+          <w:sz w:val="22"/>
+          <w:szCs w:val="22"/>
+        </w:rPr>
+        <w:t xml:space="preserve"> The question has changed. Two weeks ago it was whether the coinage could be claimed at all; with all three predecessors read, the verdict is that it can, and the question is now on what conditions. It remains a large point because it sits at the book's rhetorical climax. A hostile reviewer who knows the post-democracy literature will treat an unattributed "ornamental democracy" as Crouch rebranded, and a reviewer who has read Wolin will say that the American separation of strategic control from electoral control was diagnosed in 2008, under a different mechanism, and the book has renamed it. That second objection is the serious one, and it is not about the word. Wolin dates the condition from the Cold War: "A 'defense establishment,' comprising the economy, the military, and the state, came into being" (p. 28); "The Cold War consolidated the power of capital … What was abandoned was all talk of participatory democracy" (p. 26). If the separation was achieved by 1950 without a compute stack, the mechanism explains nothing new and the 2020s indicators measure a sixty-year-old condition. The book's best answer is that Wolin's state sheds capability, "Corporate expansion extends to military functions, a province once jealously guarded as a state prerogative" (p. 136), and that the mechanism predicts the reversal of that trajectory when a supplier can no longer be treated as a contractor. But the honest part of the answer is a concession: the ornamental route is not an emerging condition but a deepening one, and what the mechanism predicts is not its arrival but its irreversibility, the point at which the state's dependence on the decisive layer can no longer be escaped by re-tendering. Narrower than the draft now claims, and more defensible.</w:t>
+      </w:r>
+    </w:p>
+    <w:p>
+      <w:pPr>
+        <w:spacing w:after="150" w:line="290"/>
+      </w:pPr>
+      <w:r>
+        <w:rPr>
+          <w:rFonts w:ascii="Georgia" w:cs="Georgia" w:eastAsia="Georgia" w:hAnsi="Georgia"/>
+          <w:b/>
+          <w:bCs/>
+          <w:sz w:val="22"/>
+          <w:szCs w:val="22"/>
+        </w:rPr>
+        <w:t xml:space="preserve">Your choices.</w:t>
+      </w:r>
+      <w:r>
+        <w:rPr>
+          <w:rFonts w:ascii="Georgia" w:cs="Georgia" w:eastAsia="Georgia" w:hAnsi="Georgia"/>
+          <w:sz w:val="22"/>
+          <w:szCs w:val="22"/>
+        </w:rPr>
+        <w:t xml:space="preserve"> Choice A keeps the coinage on conditions: at first use in chapter 12 you introduce the term in the same breath as its pedigree, and the footer ledger claims it, no longer provisionally, at a count of one. The conditions are the sub-choices below. This costs perhaps 300 to 400 words at the ending's most loaded point and a narrowing of the claim. It buys a reviewer who sees command of the field, and it turns Wolin from a threat into the book's own unfavourable prior, the hypothesis the falsifiers are built to beat.</w:t>
+      </w:r>
+    </w:p>
+    <w:p>
+      <w:pPr>
+        <w:spacing w:after="150" w:line="290"/>
+      </w:pPr>
+      <w:r>
+        <w:rPr>
+          <w:rFonts w:ascii="Georgia" w:cs="Georgia" w:eastAsia="Georgia" w:hAnsi="Georgia"/>
+          <w:sz w:val="22"/>
+          <w:szCs w:val="22"/>
+        </w:rPr>
+        <w:t xml:space="preserve">Choice B is the bare coinage: you introduce "ornamental democracy" as your own term with no genealogy and no concession. It reads cleaner and costs nothing in words. It buys a reviewer who says, correctly, that you renamed post-democracy, and who then produces Wolin's page 28 and asks why a book about the state absorbing the stack did not notice that the separation it predicts was diagnosed a generation before the stack existed.</w:t>
+      </w:r>
+    </w:p>
+    <w:p>
+      <w:pPr>
+        <w:spacing w:after="150" w:line="290"/>
+      </w:pPr>
+      <w:r>
+        <w:rPr>
+          <w:rFonts w:ascii="Georgia" w:cs="Georgia" w:eastAsia="Georgia" w:hAnsi="Georgia"/>
+          <w:sz w:val="22"/>
+          <w:szCs w:val="22"/>
+        </w:rPr>
+        <w:t xml:space="preserve">Choice C drops the term: the ending says "post-democracy, restricted to strategic commitments", the Wolin concession is still made once, and the chapter's one coinage is spent elsewhere. This costs the sharpest label in Part III and some of the close's force; it buys complete safety on originality. A reviewer would call the book honest and slightly flat.</w:t>
+      </w:r>
+    </w:p>
+    <w:p>
+      <w:pPr>
+        <w:spacing w:after="150" w:line="290"/>
+      </w:pPr>
+      <w:r>
+        <w:rPr>
+          <w:rFonts w:ascii="Georgia" w:cs="Georgia" w:eastAsia="Georgia" w:hAnsi="Georgia"/>
+          <w:sz w:val="22"/>
+          <w:szCs w:val="22"/>
+        </w:rPr>
+        <w:t xml:space="preserve">Inside Choice A there are five conditions, each a sub-choice, recorded in ch12 memo Revisions 29–30. The first is that the term be introduced as a special case of post-democracy, not as Crouch's concept renamed, with the four Crouch quotations re-pinned to the 2004 book (pp. 5, 6, 21, 22) and the two pamphlet-only sentences kept at the pamphlet and labelled as the Fabian typescript; the alternative is to keep citing the pamphlet throughout, which is a lower tier of source when the book is to hand. The second is the adjective clause: one sentence saying the adjective occurs in neither Crouch nor Wolin, and in Bagehot only of clock-wheels, and refusing Bagehot's valuation; this is now checkable against three texts and costs a sentence. The third is that the draft's present sentence, which names Wolin "here and not cited, because it is not in the corpus", together with its [GAP] bracket, be replaced by a rival-diagnosis sentence carrying three things: that he is a rival and not a parent, that his object is the regime where yours is the commitment, and that his diagnosis is offered as hypothesis where yours publishes its falsifiers. The draft currently names Crouch and Wolin "in one breath" as a pair of allies; they are not a pair, and the text must say which is which. The fourth is the dating concession, in one clause and not a paragraph: that in the American case the separation of strategic commitments from electoral control predates the stack, and that what the mechanism predicts is irreversibility, not arrival. You can decline this and keep the stronger claim; if you do, Wolin's page 28 is the first thing a reviewer will quote. The fifth is whether to credit "predomination" (Wolin, p. 185) where the present indicator is stated, in §IV's fusion paragraph or in §VII, as his word and not adopted as the book's, and whether it should replace "fusion" as the name of spine §8(g)(3)'s indicator, since it describes exactly the American case the indicator watches: parties that combine and keep their identities. Crouch's 2004 book offers a competing figure for the same thing, the party leadership stretched into "an ellipse stretching way out beyond the party's ranks" (p. 73), and his own verdict on the fusion, "This is the central crisis of early twenty-first-century democracy" (p. 52). Either can stand beside the other; the choice is whether the indicator keeps the book's word or takes a predecessor's.</w:t>
+      </w:r>
+    </w:p>
+    <w:p>
+      <w:pPr>
+        <w:spacing w:after="150" w:line="290"/>
+      </w:pPr>
+      <w:r>
+        <w:rPr>
+          <w:rFonts w:ascii="Georgia" w:cs="Georgia" w:eastAsia="Georgia" w:hAnsi="Georgia"/>
+          <w:sz w:val="22"/>
+          <w:szCs w:val="22"/>
+        </w:rPr>
+        <w:t xml:space="preserve">There is one further sub-choice, carried over. The Lepore intake wants the whole predecessor clause in chapter 12 §VII; Decision 2 may move the constitutional close to a different section. Wherever the close lands, the predecessor clause, the Wolin concession and the Lepore collision sentence go with it. And one caution for the record: the Crouch pins now rest on the pamphlet plus a partial book, and the sharpest Crouch passages the critiques file relies on ("institutional idiot"; "impossible to see any major reversal") lie in the missing chapters, so they stay cited to the pamphlet until the rest of the 2004 book is retrieved.</w:t>
       </w:r>
     </w:p>
     <w:p>
@@ -538,7 +569,7 @@
           <w:sz w:val="22"/>
           <w:szCs w:val="22"/>
         </w:rPr>
-        <w:t xml:space="preserve"> A, and this is a view: the adjective is genuinely free, the restriction and the falsifiers are genuinely yours, and Lepore's zero hits across 306 pages strengthen the claim rather than weaken it. I would still keep the ledger line conditional until Wolin is in the repository.</w:t>
+        <w:t xml:space="preserve"> A, with all five conditions, and this is a view: the ledger check is closed in the coinage's favour on three separate runs, so the word is yours, but the claim it names is only as strong as the dating concession makes it, and I would rather the book said "irreversibility, not arrival" than had a reviewer say it first.</w:t>
       </w:r>
     </w:p>
     <w:p>
@@ -2080,7 +2111,7 @@
           <w:sz w:val="19"/>
           <w:szCs w:val="19"/>
         </w:rPr>
-        <w:t xml:space="preserve">Covers rows: (ee), Check 3</w:t>
+        <w:t xml:space="preserve">Covers rows: (ee), Check 3, and Y71-a–g (the Youings intake of 16 September)</w:t>
       </w:r>
     </w:p>
     <w:p>
@@ -2103,20 +2134,20 @@
           <w:sz w:val="22"/>
           <w:szCs w:val="22"/>
         </w:rPr>
-        <w:t xml:space="preserve"> A fortnight ago you ruled that England's Tudor turn happened in the 1530s, and that the dissolution of the monasteries was the money behind it — in the book's shorthand, its "fisc", meaning the revenue a crown could count on without asking anyone's leave. Chapter 11, section II, now says so in two sentences: "The settlement arrived when the crown found a fisc that no assembly had to grant", and "The dissolution is the English fisc of the settlement." Behind both sits the book's spine, the short doctrine document that states the argument's fixed points; its section 3 says that "standing taxation" was "established" as part of the settlement, and for England that sentence currently reads at the 1530s.</w:t>
-      </w:r>
-    </w:p>
-    <w:p>
-      <w:pPr>
-        <w:spacing w:after="150" w:line="290"/>
-      </w:pPr>
-      <w:r>
-        <w:rPr>
-          <w:rFonts w:ascii="Georgia" w:cs="Georgia" w:eastAsia="Georgia" w:hAnsi="Georgia"/>
-          <w:sz w:val="22"/>
-          <w:szCs w:val="22"/>
-        </w:rPr>
-        <w:t xml:space="preserve">Since that ruling, one of the works in the September reading has landed directly on it. Thomas Ertman, an American political scientist, published </w:t>
+        <w:t xml:space="preserve"> A fortnight ago you ruled that England's Tudor turn happened in the 1530s, and that the dissolution of the monasteries was the money behind it — in the book's shorthand, its "fisc", meaning the revenue a crown could count on without asking anyone's leave. Chapter 11, section II, now says so in two sentences: "The settlement arrived when the crown found a fisc that no assembly had to grant", and "The dissolution is the English fisc of the settlement." Behind both sits the book's spine, the short doctrine document that states the argument's fixed points; its section 3 says that "standing taxation" was "established" as part of the settlement, and for England that sentence currently reads at the 1530s. The earlier version of this decision treated Thomas Ertman as the only new evidence and said that the two English historians who could settle the fiscal question, Joyce Youings and Richard Hoyle, were not yet in the reading. Youings has been read since, in full, on 16 September, and she settles more than the earlier version expected.</w:t>
+      </w:r>
+    </w:p>
+    <w:p>
+      <w:pPr>
+        <w:spacing w:after="150" w:line="290"/>
+      </w:pPr>
+      <w:r>
+        <w:rPr>
+          <w:rFonts w:ascii="Georgia" w:cs="Georgia" w:eastAsia="Georgia" w:hAnsi="Georgia"/>
+          <w:sz w:val="22"/>
+          <w:szCs w:val="22"/>
+        </w:rPr>
+        <w:t xml:space="preserve">Ertman first. An American political scientist, he published </w:t>
       </w:r>
       <w:r>
         <w:rPr>
@@ -2134,20 +2165,69 @@
           <w:sz w:val="22"/>
           <w:szCs w:val="22"/>
         </w:rPr>
-        <w:t xml:space="preserve"> (Cambridge, 1997) to explain why European states formed differently from one another, and his variable is the administration: whether office was held by salaried servants or by men who had bought their posts and treated them as property. That second condition he calls patrimonialism. His section on the very decades you ruled for is titled "Deepening Patrimonialism and Its Temporary Demise, 1453–1659" (p. 178). He grants that Thomas Cromwell's new revenue boards of the 1530s "did represent a serious challenge to the Exchequer, that bastion of proprietary officeholding", and then takes it back: "Yet by 1554 the most important of these bodies … had all been incorporated into the Exchequer", because of "the absence of war and thus of the incentives it would have created for military effectiveness" (p. 181). He adds that "if one looks only at central government, England fares worse than Castile" (p. 181), and that "By the reign of Charles I, the English state had become a kind of parasite" (p. 184). His English fiscal-military state — the term for a state built to raise permanent taxes for a permanent army — belongs to 1660–1714, made by a Parliament sitting every year under the pressure of war (p. 187). The dissolution of the monasteries does not appear in his account of England at all.</w:t>
-      </w:r>
-    </w:p>
-    <w:p>
-      <w:pPr>
-        <w:spacing w:after="150" w:line="290"/>
-      </w:pPr>
-      <w:r>
-        <w:rPr>
-          <w:rFonts w:ascii="Georgia" w:cs="Georgia" w:eastAsia="Georgia" w:hAnsi="Georgia"/>
-          <w:sz w:val="22"/>
-          <w:szCs w:val="22"/>
-        </w:rPr>
-        <w:t xml:space="preserve">The person who assessed Ertman for you was blunt about what this does and does not prove. It does not overturn the Tudor turn. Ertman's test is proprietary office, so a permanent confiscation that ended a rival universal institution — the Church's English estate — is invisible to his test by construction; and his "little large-scale warfare" quietly skips the 1540s, when Henry VIII's wars cost more than the dissolution had brought in. What the assessment could not do was carry the word "standing". The dissolution was a capital receipt — a one-off sale of land — spent within a decade, not a tax collected every year; and the 1552 statute against trafficking in offices (p. 182) shows Parliament, not the crown, still fighting over the machinery. The two English historians who could settle this, Joyce Youings and Richard Hoyle, are not yet in the reading and are marked as a gap.</w:t>
+        <w:t xml:space="preserve"> (Cambridge, 1997) to explain why European states formed differently from one another, and his variable is the administration: whether office was held by salaried servants or by men who had bought their posts and treated them as property, which he calls patrimonialism. His section on the decades you ruled for is titled "Deepening Patrimonialism and Its Temporary Demise, 1453–1659" (p. 178). He grants that Thomas Cromwell's new revenue boards of the 1530s "did represent a serious challenge to the Exchequer, that bastion of proprietary officeholding", and then takes it back: "Yet by 1554 the most important of these bodies … had all been incorporated into the Exchequer", because of "the absence of war and thus of the incentives it would have created for military effectiveness" (p. 181). His English fiscal-military state — the term for a state built to raise permanent taxes for a permanent army — belongs to 1660–1714, made by a Parliament sitting every year under the pressure of war (p. 187). The dissolution does not appear in his account of England at all. The assessment of him was blunt: his test is proprietary office, so a permanent confiscation that ended a rival universal institution is invisible to it by construction, and his "little large-scale warfare" quietly skips the 1540s.</w:t>
+      </w:r>
+    </w:p>
+    <w:p>
+      <w:pPr>
+        <w:spacing w:after="150" w:line="290"/>
+      </w:pPr>
+      <w:r>
+        <w:rPr>
+          <w:rFonts w:ascii="Georgia" w:cs="Georgia" w:eastAsia="Georgia" w:hAnsi="Georgia"/>
+          <w:sz w:val="22"/>
+          <w:szCs w:val="22"/>
+        </w:rPr>
+        <w:t xml:space="preserve">Now Youings. </w:t>
+      </w:r>
+      <w:r>
+        <w:rPr>
+          <w:rFonts w:ascii="Georgia" w:cs="Georgia" w:eastAsia="Georgia" w:hAnsi="Georgia"/>
+          <w:i/>
+          <w:iCs/>
+          <w:sz w:val="22"/>
+          <w:szCs w:val="22"/>
+        </w:rPr>
+        <w:t xml:space="preserve">The Dissolution of the Monasteries</w:t>
+      </w:r>
+      <w:r>
+        <w:rPr>
+          <w:rFonts w:ascii="Georgia" w:cs="Georgia" w:eastAsia="Georgia" w:hAnsi="Georgia"/>
+          <w:sz w:val="22"/>
+          <w:szCs w:val="22"/>
+        </w:rPr>
+        <w:t xml:space="preserve"> (Allen &amp; Unwin, 1971) is the standard account of the operation, and she treats it as a property transaction: "an act of resumption, a restoration to secular uses of land and other endowments provided over many centuries, very largely by laymen" (ch. 1). One caution about citing her: the corpus copy is an electronic reissue that preserves no printed page numbers, so every pin below is to a chapter, and page-image verification is owed before print. She confirms your ruling more strongly than the draft dared. The confiscation "had just about doubled the Crown's resources", and the Court of Augmentations, the new department built to hold the land, "replaced the king's chamber as the bank from which the king's government, and his personal extravagances, could be paid for" (ch. 4). The 1538–39 surrenders ran on commissions that "had no statutory authority" (ch. 3), with no Parliament even planned; the Church was subordinated by paper, "Certainly it was not with the use of armed force" (ch. 1). And she supplies the instruments, which is what the chapter's flagged sentence about a "universalist power" needed: the 1535 Injunctions loosed every religious from obedience to Rome "or to any other foreign power or person" (Doc. 7), and the communities "were never, in so many words, actually dissolved … Institutions which for the most part traced their foundation to gifts of landed property came to an end with the surrender of that property" (ch. 1). The fiscal act was the canonical act.</w:t>
+      </w:r>
+    </w:p>
+    <w:p>
+      <w:pPr>
+        <w:spacing w:after="150" w:line="290"/>
+      </w:pPr>
+      <w:r>
+        <w:rPr>
+          <w:rFonts w:ascii="Georgia" w:cs="Georgia" w:eastAsia="Georgia" w:hAnsi="Georgia"/>
+          <w:sz w:val="22"/>
+          <w:szCs w:val="22"/>
+        </w:rPr>
+        <w:t xml:space="preserve">Then she takes the word "standing" away. "It has long been recognized that the Dissolution did not lead to the permanent augmentation of the annual income of the Crown" (ch. 1). The intention was permanence: the Augmentations act "is the strongest possible argument for the government's determination … to retain its new resources permanently in its own hands" (ch. 2). The outcome was not: "Disposal by the Crown took place from the very beginning" (ch. 3); Cromwell himself was named a sales commissioner in December 1539; land sold "at twenty years' purchase, that is a capital sum of twenty times their current net annual value" (ch. 5); outright grants ran fifteen, thirty-five, seventy-five and a hundred and twelve across 1536–39; and "by the end of Henry VIII's reign over half of the whole of the former monastic estates had been alienated … well over three-quarters by 1558" (ch. 5). The department built to hold the estate spent its life disposing of it and was folded into the Exchequer in 1554. Put plainly: the crown took a stock, not a flow, and sold it at a fixed price to the county families who would fill the next century's Parliaments. She and Ertman converge from two directions — his boards reabsorbed by 1554, her revenue by 1558 — and neither was writing with the other's argument in mind. Two smaller things she adds: the houses that died in 1536 were chosen by the </w:t>
+      </w:r>
+      <w:r>
+        <w:rPr>
+          <w:rFonts w:ascii="Georgia" w:cs="Georgia" w:eastAsia="Georgia" w:hAnsi="Georgia"/>
+          <w:i/>
+          <w:iCs/>
+          <w:sz w:val="22"/>
+          <w:szCs w:val="22"/>
+        </w:rPr>
+        <w:t xml:space="preserve">Valor Ecclesiasticus</w:t>
+      </w:r>
+      <w:r>
+        <w:rPr>
+          <w:rFonts w:ascii="Georgia" w:cs="Georgia" w:eastAsia="Georgia" w:hAnsi="Georgia"/>
+          <w:sz w:val="22"/>
+          <w:szCs w:val="22"/>
+        </w:rPr>
+        <w:t xml:space="preserve"> of January 1535, a survey with "no justification whatsoever for regarding it as anything more than a taxation assessment" (ch. 2), which is your legibility point in one document; and the money went to fortification, coastal-defence works at Weymouth and Falmouth and garrison wages, but there is no artillery anywhere in her book.</w:t>
       </w:r>
     </w:p>
     <w:p>
@@ -2170,7 +2250,7 @@
           <w:sz w:val="22"/>
           <w:szCs w:val="22"/>
         </w:rPr>
-        <w:t xml:space="preserve"> This is a large point, because it touches the spine and a ruling you have already made, and because the book's own word is the problem. The mechanism says weapon cost forces permanent taxation, and permanent taxation builds the administration that subordinates the lords. If England's "standing taxation" rests on a single sale of monastic land, a hostile early-modernist will say the book has put a capital receipt where its own argument demands a recurring tax, and will cite Ertman's section title to show the 1530s administration went backwards. The exposure is one sentence in the spine and two in Chapter 11, but they are sentences the argument leans on.</w:t>
+        <w:t xml:space="preserve"> This is a large point, because it touches the spine, a ruling you have already made, and the book's own word. The mechanism says weapon cost forces permanent taxation, and permanent taxation builds the administration that subordinates the lords. Youings shows the English crown taking the right asset in the wrong form: France's taille could be levied again every year and could not be spent out; the monastic estate was capital and was. A hostile early-modernist now has two authorities, not one, saying the 1530s produced no standing revenue, and the second is the standard account of the very operation you named as the fisc. The exposure is still one sentence in the spine and two in Chapter 11, but they are sentences the argument leans on. The gain, if you take it, is that the English case becomes the book's clearest demonstration of which link in the chain is load-bearing: permanence of finance, not size of seizure. That reading is the book's inference, not hers, and must be flagged as such. The intake also recorded one objection not yet answered: the gentry who bought the land at twenty years' purchase were the beneficiaries of the windfall, and the chapter does not yet say what that did to the subordination the settlement is supposed to have achieved.</w:t>
       </w:r>
     </w:p>
     <w:p>
@@ -2193,20 +2273,64 @@
           <w:sz w:val="22"/>
           <w:szCs w:val="22"/>
         </w:rPr>
-        <w:t xml:space="preserve"> Choice A is "fisc without permanence": keep the 1530s as England's turn, but reclassify what happened in that decade. The dissolution becomes the irreversible confiscation that made the crown the only universal authority in England — a change in who held jurisdiction and property, not in who paid annual tax — and the standing-taxation limb of the mechanism moves to where Ertman and John Brewer put it, the 1690s, when Parliament voted war taxes year after year and the Bank of England was founded. On the page, Chapter 11 section II gets a recast paragraph and a sentence pointing forward a century and a half; the spine's section 3 gains a line saying that for England the two links arrived separately. It costs you a tidy single date and obliges you to say the English case took two stages. It buys a sentence that no early-modernist will contest, and it makes England the book's clearest example of the jurisdictional link and the fiscal link arriving at different times — which is a finding, not a retreat.</w:t>
-      </w:r>
-    </w:p>
-    <w:p>
-      <w:pPr>
-        <w:spacing w:after="150" w:line="290"/>
-      </w:pPr>
-      <w:r>
-        <w:rPr>
-          <w:rFonts w:ascii="Georgia" w:cs="Georgia" w:eastAsia="Georgia" w:hAnsi="Georgia"/>
-          <w:sz w:val="22"/>
-          <w:szCs w:val="22"/>
-        </w:rPr>
-        <w:t xml:space="preserve">Choice B keeps the ruling as it stands and names Ertman as a disanalogy — the book's word for a place where the historical case and the modern one are admitted to differ. Chapter 11 section II would carry roughly a hundred and fifty words conceding that the leading authority on administrative development reads the 1530s as a deepening of patrimonialism, and answering with three points: the 1540s wars, the blindness of his test to confiscation, and the fact that your turn is about canon and jurisdiction rather than revenue boards. Nothing moves in the spine. This is cheaper and keeps the Tudor turn tidy. But it leaves the word "standing" attached to a receipt the reading cannot show was standing, and that is exactly where the reviewer will push.</w:t>
+        <w:t xml:space="preserve"> Choice A is "fisc without permanence": keep the 1530s as England's turn, but reclassify what happened. The dissolution becomes the irreversible confiscation that made the crown the only universal authority in England — a change in who held jurisdiction and property, not in who paid annual tax — and the standing-taxation limb moves to where Ertman and John Brewer put it, the 1690s. Chapter 11 §II gets a recast paragraph and a sentence pointing forward a century and a half; spine §3 gains a line saying that for England the two links arrived separately. It costs a tidy single date and obliges you to say the English case took two stages. It buys a sentence no early-modernist will contest, with Youings now cited for both halves of it.</w:t>
+      </w:r>
+    </w:p>
+    <w:p>
+      <w:pPr>
+        <w:spacing w:after="150" w:line="290"/>
+      </w:pPr>
+      <w:r>
+        <w:rPr>
+          <w:rFonts w:ascii="Georgia" w:cs="Georgia" w:eastAsia="Georgia" w:hAnsi="Georgia"/>
+          <w:sz w:val="22"/>
+          <w:szCs w:val="22"/>
+        </w:rPr>
+        <w:t xml:space="preserve">Choice B keeps the ruling as it stands and names Ertman and Youings as a stated disanalogy — the book's word for a place where the historical case and the modern one are admitted to differ. Chapter 11 §II would carry perhaps two hundred words conceding that the leading authority on administrative development reads the 1530s as a deepening of patrimonialism and that the standard historian of the dissolution reads it as a dissipated windfall, and answering with the 1540s wars, the blindness of Ertman's test to confiscation, and the fact that your turn is about canon and jurisdiction rather than revenue. Nothing moves in the spine. This is cheaper and keeps the Tudor turn tidy. But "standing" stays attached to a receipt that the standard account says was sold off within a generation, and that is exactly where the reviewer will push.</w:t>
+      </w:r>
+    </w:p>
+    <w:p>
+      <w:pPr>
+        <w:spacing w:after="150" w:line="290"/>
+      </w:pPr>
+      <w:r>
+        <w:rPr>
+          <w:rFonts w:ascii="Georgia" w:cs="Georgia" w:eastAsia="Georgia" w:hAnsi="Georgia"/>
+          <w:sz w:val="22"/>
+          <w:szCs w:val="22"/>
+        </w:rPr>
+        <w:t xml:space="preserve">Whichever you take, the Youings intake put three readings of ruling (k) to you and adopted none; they are the sub-choice inside the qualifying clause that Chapter 11 §II now owes (Y71-a), and they imply different readings of spine §3's "standing taxation" for England. The first reads the mechanism as predicting the crown's requirement and its attempt, not the durability of what it got, so that Youings supplies the attempt in its strongest form and the sentence stands with "standing" struck. The second dates the fisc by the moment of acquisition — the Augmentations of 1536 — rather than by how long the crown held it, which keeps the 1530s but concedes the flow in a clause. The third states the stock-versus-flow distinction in the text as the English case's own disanalogy, which turns §II's weakest passage into the sharpest illustration the mechanism has of why permanent finance is the load-bearing link. The third is the boldest and is the one Choice A rests on; the first is compatible with either choice; the second is Choice B in a milder form.</w:t>
+      </w:r>
+    </w:p>
+    <w:p>
+      <w:pPr>
+        <w:spacing w:after="150" w:line="290"/>
+      </w:pPr>
+      <w:r>
+        <w:rPr>
+          <w:rFonts w:ascii="Georgia" w:cs="Georgia" w:eastAsia="Georgia" w:hAnsi="Georgia"/>
+          <w:sz w:val="22"/>
+          <w:szCs w:val="22"/>
+        </w:rPr>
+        <w:t xml:space="preserve">Six smaller sub-choices ride with it. Whether the chapter's flagged sentence on the "universalist power" is recast to rest on effect and instrument rather than motive, since Youings denies the anti-papal motive but her documents supply the instruments, and whether "executed in England as a single act" becomes one apparatus in one decade (Y71-b). Whether the stock-versus-flow distinction goes into the text or stays in the memo (Y71-c), which is really the same question as the three readings. Whether the </w:t>
+      </w:r>
+      <w:r>
+        <w:rPr>
+          <w:rFonts w:ascii="Georgia" w:cs="Georgia" w:eastAsia="Georgia" w:hAnsi="Georgia"/>
+          <w:i/>
+          <w:iCs/>
+          <w:sz w:val="22"/>
+          <w:szCs w:val="22"/>
+        </w:rPr>
+        <w:t xml:space="preserve">Valor</w:t>
+      </w:r>
+      <w:r>
+        <w:rPr>
+          <w:rFonts w:ascii="Georgia" w:cs="Georgia" w:eastAsia="Georgia" w:hAnsi="Georgia"/>
+          <w:sz w:val="22"/>
+          <w:szCs w:val="22"/>
+        </w:rPr>
+        <w:t xml:space="preserve"> enters §II as one clause, a tax register of January 1535 deciding which houses died in 1536 (Y71-d). Whether the 1538 invasion scare and the coastal-defence warrants enter §II at all, given that her own footnote denies any financial crisis before 1540 and that the passage would claim fortification and never guns (Y71-e). Whether a residual flag on crown ordinary revenue before and after the dissolution is opened, with Hoyle on the retrieval list, or the comparison is dropped, since Youings insists no balance sheet of the operation has ever been drawn and refuses to supply one (Y71-f). And a caution for the record rather than a choice: her book is a volume in Geoffrey Elton's own series, read in draft by Elton, and the project's rules forbid using it as independent corroboration of the Elton frame in the passages where the book engages the Elton-revision debate (Y71-g).</w:t>
       </w:r>
     </w:p>
     <w:p>
@@ -2229,7 +2353,7 @@
           <w:sz w:val="22"/>
           <w:szCs w:val="22"/>
         </w:rPr>
-        <w:t xml:space="preserve"> Choice A is the stronger, and the two are not exclusive — the disanalogy paragraph is worth writing either way. My reason is simple: I would not let "standing taxation" stand against the 1530s until Youings or Hoyle is in the reading, and Choice A is the only one that does not depend on them turning up.</w:t>
+        <w:t xml:space="preserve"> Choice A with the third reading, and this is a view: the earlier version of this decision said it would not let "standing taxation" stand against the 1530s until Youings or Hoyle was in the reading; Youings is, and she says it was not standing. Choice A is the only reading that turns that into a finding rather than a retreat.</w:t>
       </w:r>
     </w:p>
     <w:p>
@@ -2563,7 +2687,7 @@
           <w:sz w:val="25"/>
           <w:szCs w:val="25"/>
         </w:rPr>
-        <w:t xml:space="preserve">Decision 10 — What "the ratchet" is: artillery only, or capital-intensity in general</w:t>
+        <w:t xml:space="preserve">Decision 10 — What "the ratchet" is, and whose thesis it is: artillery only, or capital-intensity in general; Finer, Bean and Tilly as predecessors</w:t>
       </w:r>
     </w:p>
     <w:p>
@@ -2579,7 +2703,20 @@
           <w:sz w:val="19"/>
           <w:szCs w:val="19"/>
         </w:rPr>
-        <w:t xml:space="preserve">Covers rows: (ddd), (yyy), (ooo), Check 4</w:t>
+        <w:t xml:space="preserve">Covers rows: (ddd), (yyy), (ooo), Check 4, and — folded in from Decision 11 — (mmm), Check 2, T75-a–d and B73-a–c (the Tilly 1975 and Bean 1973 intakes of 16 September)</w:t>
+      </w:r>
+    </w:p>
+    <w:p>
+      <w:pPr>
+        <w:spacing w:after="150" w:line="290"/>
+      </w:pPr>
+      <w:r>
+        <w:rPr>
+          <w:rFonts w:ascii="Georgia" w:cs="Georgia" w:eastAsia="Georgia" w:hAnsi="Georgia"/>
+          <w:sz w:val="22"/>
+          <w:szCs w:val="22"/>
+        </w:rPr>
+        <w:t xml:space="preserve">Decision 11 has been folded into this one. The earlier version of that decision said Bean's 1973 article was not in the corpus; it was read and assessed on 16 September, and the same day's reading of the full Tilly 1975 volume showed that the question Decision 11 asked — how the book differs from the artillery thesis Tilly rejected — is the same question as this decision's, asked about a predecessor rather than a rival. One decision is cleaner than two.</w:t>
       </w:r>
     </w:p>
     <w:p>
@@ -2602,20 +2739,20 @@
           <w:sz w:val="22"/>
           <w:szCs w:val="22"/>
         </w:rPr>
-        <w:t xml:space="preserve"> "The ratchet" is the book's word for the point at which the change became irreversible: once a crown had bought the siege train and the permanent tax to keep it, no subject could match it and no assembly could take it back. The spine, in section 8(a), speaks of "the ratchet" with a definite article and no qualification, and the Coda and the chapters inherit that usage. Chapter 4 (sections II and VII), Chapter 6 (section VII) and Chapter 10 (sections IV and VII) all carry the account of what the guns did; the old rows do not quote a single sentence from Chapters 4 and 6, so I cannot show you their present wording, only what they claim.</w:t>
-      </w:r>
-    </w:p>
-    <w:p>
-      <w:pPr>
-        <w:spacing w:after="150" w:line="290"/>
-      </w:pPr>
-      <w:r>
-        <w:rPr>
-          <w:rFonts w:ascii="Georgia" w:cs="Georgia" w:eastAsia="Georgia" w:hAnsi="Georgia"/>
-          <w:sz w:val="22"/>
-          <w:szCs w:val="22"/>
-        </w:rPr>
-        <w:t xml:space="preserve">Three works in the September reading press on that definite article from three directions. William McNeill, the American world historian, in </w:t>
+        <w:t xml:space="preserve"> "The ratchet" is the book's word for the point at which the change became irreversible: once a crown had bought the siege train and the permanent tax to keep it, no subject could match it and no assembly could take it back. The spine, in section 8(a), speaks of "the ratchet" with a definite article and no qualification, and the Coda and the chapters inherit that usage. Chapter 4 (sections II and VII), Chapter 6 (section VII) and Chapter 10 (sections IV and VII) carry the account of what the guns did; the old rows do not quote a sentence from Chapters 4 and 6, so I cannot show you their present wording, only what they claim.</w:t>
+      </w:r>
+    </w:p>
+    <w:p>
+      <w:pPr>
+        <w:spacing w:after="150" w:line="290"/>
+      </w:pPr>
+      <w:r>
+        <w:rPr>
+          <w:rFonts w:ascii="Georgia" w:cs="Georgia" w:eastAsia="Georgia" w:hAnsi="Georgia"/>
+          <w:sz w:val="22"/>
+          <w:szCs w:val="22"/>
+        </w:rPr>
+        <w:t xml:space="preserve">Three works in the September reading press on that definite article. William McNeill, the American world historian, in </w:t>
       </w:r>
       <w:r>
         <w:rPr>
@@ -2633,20 +2770,7 @@
           <w:sz w:val="22"/>
           <w:szCs w:val="22"/>
         </w:rPr>
-        <w:t xml:space="preserve"> (Chicago, 1982), agrees with you on direction: "The power of any ruler who was able to afford the high cost of the new weapons was therefore enhanced at the expense of neighbors and subjects who were unable to avail themselves of the new technology of war. In Europe, the major effect of the new weaponry was to dwarf the Italian city-states and to reduce other small sovereignties to triviality" (p. 89). But his fifteenth century belongs to Venice, not to the French artillery office. "A regular standing army of known size and capability emerged in the better-governed cities of Italy during the first half of the fifteenth century" (p. 75), two generations before Charles VII's guns; and the suppression of the Fronde in the 1650s "marked the time at which transalpine states finally caught up with the level of administrative management and control over armed force that had been attained in Venice and Milan two centuries earlier" (p. 125). Civil control of hired force, in other words, was an Italian achievement of contract administration, made without a siege train. His own answer to why Italy nonetheless lost is on the facing page: "When newly consolidated monarchies, commanding comparatively vast territories, chose to intervene in Italian affairs, the sovereignty of mere city-states, however skillfully managed, could not permanently be maintained" (p. 79). The book does not currently cite McNeill anywhere.</w:t>
-      </w:r>
-    </w:p>
-    <w:p>
-      <w:pPr>
-        <w:spacing w:after="150" w:line="290"/>
-      </w:pPr>
-      <w:r>
-        <w:rPr>
-          <w:rFonts w:ascii="Georgia" w:cs="Georgia" w:eastAsia="Georgia" w:hAnsi="Georgia"/>
-          <w:sz w:val="22"/>
-          <w:szCs w:val="22"/>
-        </w:rPr>
-        <w:t xml:space="preserve">Jan Glete, a Swedish historian of early-modern navies, in </w:t>
+        <w:t xml:space="preserve"> (Chicago, 1982), agrees on direction — the new weapons enhanced the power of any ruler who could afford them "at the expense of neighbors and subjects who were unable to avail themselves of the new technology of war" and served "to dwarf the Italian city-states and to reduce other small sovereignties to triviality" (p. 89) — but his fifteenth century belongs to Venice: "A regular standing army of known size and capability emerged in the better-governed cities of Italy during the first half of the fifteenth century" (p. 75), and the Fronde's suppression in the 1650s "marked the time at which transalpine states finally caught up with the level of administrative management and control over armed force that had been attained in Venice and Milan two centuries earlier" (p. 125). Civil control of hired force was an Italian achievement made without a siege train; Italy lost anyway because "the sovereignty of mere city-states, however skillfully managed, could not permanently be maintained" against "newly consolidated monarchies, commanding comparatively vast territories" (p. 79). Jan Glete, a Swedish historian of early-modern navies, in </w:t>
       </w:r>
       <w:r>
         <w:rPr>
@@ -2664,33 +2788,20 @@
           <w:sz w:val="22"/>
           <w:szCs w:val="22"/>
         </w:rPr>
-        <w:t xml:space="preserve"> (Routledge, 2002), supplies a second form of the same effect. His most capital-intensive and most completely state-owned military organisations are navies, and they did not begin with a broken wall: "Most of the earliest sailing navies were created on the European periphery: in Portugal, England, Denmark-Norway and Sweden. They were small forces created by naval-minded kings for protection selling and as instruments of dynastic ambition … Private trade and shipping interests were of little importance for the early growth of sailing navies" (p. 39). The logic is the same as yours — heavy guns "were capital goods, and mobile siege artillery required a permanent organisation of skilled men" (p. 65), and the heaviest ordnance "could only be carried by special warships of a size and construction that made them less economic as merchantmen" (p. 65) — but the instrument is a ship. Tilly makes the same point from the other side: "The increasing decisiveness of naval warfare, which occurred simultaneously, could well have shifted the military advantage to small maritime powers such as the Dutch Republic." If that is right, the navy is a path by which a small, rich polity survives the artillery age rather than being dwarfed by it.</w:t>
-      </w:r>
-    </w:p>
-    <w:p>
-      <w:pPr>
-        <w:spacing w:after="150" w:line="290"/>
-      </w:pPr>
-      <w:r>
-        <w:rPr>
-          <w:rFonts w:ascii="Georgia" w:cs="Georgia" w:eastAsia="Georgia" w:hAnsi="Georgia"/>
-          <w:sz w:val="22"/>
-          <w:szCs w:val="22"/>
-        </w:rPr>
-        <w:t xml:space="preserve">The third pressure comes from the fortress. The trace italienne is the low, thick, angled bastion fortification the Italians developed to resist cannon, and the objection has always been that it cancelled the guns within a generation. Chapter 10 has never answered it. McNeill does, six years before Geoffrey Parker made the argument famous: "Only the wealthiest states and cities could afford the scores of cannon and the enormous labor of construction required by the trace italienne" (p. 90), so "high technology once again favored local defenses, at least in those regions where governments could afford the cost of the new fortifications … This put a very effective obstacle in the way of the political consolidation of Europe into a single imperial unity" (p. 91); "Imperial consolidation halted halfway" (p. 91). The guns consolidated inside the polities that could pay; the fortress froze the map between them. That is your three-or-four-bloc prediction in sixteenth-century form.</w:t>
-      </w:r>
-    </w:p>
-    <w:p>
-      <w:pPr>
-        <w:spacing w:after="150" w:line="290"/>
-      </w:pPr>
-      <w:r>
-        <w:rPr>
-          <w:rFonts w:ascii="Georgia" w:cs="Georgia" w:eastAsia="Georgia" w:hAnsi="Georgia"/>
-          <w:sz w:val="22"/>
-          <w:szCs w:val="22"/>
-        </w:rPr>
-        <w:t xml:space="preserve">Finally, the eyewitness. Philippe de Commynes served Charles VIII on the Italian expedition of 1494, and the third volume of Joseph Calmette's scholarly edition of his </w:t>
+        <w:t xml:space="preserve"> (Routledge, 2002), supplies a second form of the same effect: the most capital-intensive and most completely state-owned military organisations were navies, and they did not begin with a broken wall: "Most of the earliest sailing navies were created on the European periphery: in Portugal, England, Denmark-Norway and Sweden … Private trade and shipping interests were of little importance for the early growth of sailing navies" (p. 39); heavy guns "were capital goods, and mobile siege artillery required a permanent organisation of skilled men" (p. 65), but the heaviest ordnance needed "special warships of a size and construction that made them less economic as merchantmen" (p. 65). The third pressure is the fortress. The trace italienne, the low, thick, angled bastion the Italians developed to resist cannon, is said to have cancelled the guns within a generation, and Chapter 10 has never answered it. McNeill does: "Only the wealthiest states and cities could afford the scores of cannon and the enormous labor of construction required by the trace italienne" (p. 90), so that "Imperial consolidation halted halfway" (p. 91). The guns consolidated inside the polities that could pay; the fortress froze the map between them, which is your three-or-four-bloc prediction in sixteenth-century form.</w:t>
+      </w:r>
+    </w:p>
+    <w:p>
+      <w:pPr>
+        <w:spacing w:after="150" w:line="290"/>
+      </w:pPr>
+      <w:r>
+        <w:rPr>
+          <w:rFonts w:ascii="Georgia" w:cs="Georgia" w:eastAsia="Georgia" w:hAnsi="Georgia"/>
+          <w:sz w:val="22"/>
+          <w:szCs w:val="22"/>
+        </w:rPr>
+        <w:t xml:space="preserve">Then the eyewitness. Philippe de Commynes served Charles VIII on the Italian expedition of 1494, and the third volume of Joseph Calmette's edition of his </w:t>
       </w:r>
       <w:r>
         <w:rPr>
@@ -2708,7 +2819,95 @@
           <w:sz w:val="22"/>
           <w:szCs w:val="22"/>
         </w:rPr>
-        <w:t xml:space="preserve"> (Champion, 1925) is now in the repository. In the book's grading this is T1, a primary source, where the Chapter 10 close now rests on T2, a modern historian (Contamine) summarising another (Giovio). Commynes says the Italians "n'entendoient point le faict de l'artillerie" — did not understand the business of artillery — "et en France n'avoit jamais esté si bien entendue" (p. 50); that Monte San Giovanni, "une très forte place" (p. 91), "fut batue sept ou huyt heures et puis prinse d'assault" — was battered seven or eight hours and then taken by storm (p. 92); and that "hors le chasteau de Napples, n'y eut nul qui empeschast le roy ung jour naturel" — apart from the castle of Naples, nothing held the king up for a single day (p. 81). The famous quip that the French conquered Italy with chalk to mark their billets is his: "de la craye en la main des fourriers pour marcher leurs logis, sans aultre peyne" (pp. 81–82). The same volume carries the discipline. At Fornovo, the one open battle of the campaign, "Je ne croy point que l'artillerie des deux costéz tuast dix hommes et ne dura point le combat ung quart d'heure" — I do not believe the artillery of both sides killed ten men, and the fight did not last a quarter of an hour (p. 192), with Calmette's note reporting the explanation that a storm had wetted the powder. One housekeeping point: an earlier row pinned the Fornovo line to pp. 210–11, which in fact carry the Apennine recrossing and the line that the train lost "une seulle pierre ne une livre de pouldre"; the pin must be p. 192. And one honesty point: Commynes's own explanation of the campaign is providential — God's judgement on Italy — and he never credits the tax machine the mechanism runs on.</w:t>
+        <w:t xml:space="preserve"> (Champion, 1925) is in the repository. In the book's grading this is T1, a primary source, where Chapter 10's close now rests on T2, a modern historian summarising another. The Italians "n'entendoient point le faict de l'artillerie … et en France n'avoit jamais esté si bien entendue" (p. 50); Monte San Giovanni, "une très forte place" (p. 91), "fut batue sept ou huyt heures et puis prinse d'assault" (p. 92); "hors le chasteau de Napples, n'y eut nul qui empeschast le roy ung jour naturel" (p. 81); and the chalk with which the quartermasters marked their billets is his (pp. 81–82). The same volume carries the discipline: at Fornovo, the one open battle, "Je ne croy point que l'artillerie des deux costéz tuast dix hommes et ne dura point le combat ung quart d'heure" (p. 192), with Calmette's note reporting wetted powder. An earlier row pinned that line to pp. 210–11, which carry the Apennine recrossing; the pin must be p. 192. And Commynes's own explanation of the campaign is providential; he never credits the tax machine.</w:t>
+      </w:r>
+    </w:p>
+    <w:p>
+      <w:pPr>
+        <w:spacing w:after="150" w:line="290"/>
+      </w:pPr>
+      <w:r>
+        <w:rPr>
+          <w:rFonts w:ascii="Georgia" w:cs="Georgia" w:eastAsia="Georgia" w:hAnsi="Georgia"/>
+          <w:sz w:val="22"/>
+          <w:szCs w:val="22"/>
+        </w:rPr>
+        <w:t xml:space="preserve">Now the new material, which is about whose thesis this is. The book has always cited Charles Tilly, the American sociologist whose "War made the state, and the state made war" is the field's slogan, and it has always treated him as saying nothing about guns. The spine distinguishes the book's claim from his as "not war-made-the-state in general"; Chapter 6 §VII introduces its main objection as coming "from the historian this chapter has cited more than any other"; Chapter 10 §VII, Objection 6, calls him deliberately technology-agnostic. All three are wrong, and wrong twice over. In his 1985 essay "War Making and State Making as Organized Crime" Tilly summarised a 1973 article by the economic historian Richard Bean and rejected it: "Bean's summary does not stand up to historical scrutiny. As a matter of practice, the shift to infantry-backed artillery sieges of fortified cities occurred only during the sixteenth and seventeenth centuries. Artillery did improve during the fifteenth century, but the invention of new fortifications, especially the trace italienne, rapidly countered the advantage of artillery. The arrival of effective artillery came too late to have caused the increase in the viable size of states. (However, the increased cost of fortifications to defend against artillery did give an advantage to states enjoying larger fiscal bases.)" That is a verdict, not a silence. And ten years earlier, in the 1975 volume he edited, </w:t>
+      </w:r>
+      <w:r>
+        <w:rPr>
+          <w:rFonts w:ascii="Georgia" w:cs="Georgia" w:eastAsia="Georgia" w:hAnsi="Georgia"/>
+          <w:i/>
+          <w:iCs/>
+          <w:sz w:val="22"/>
+          <w:szCs w:val="22"/>
+        </w:rPr>
+        <w:t xml:space="preserve">The Formation of National States in Western Europe</w:t>
+      </w:r>
+      <w:r>
+        <w:rPr>
+          <w:rFonts w:ascii="Georgia" w:cs="Georgia" w:eastAsia="Georgia" w:hAnsi="Georgia"/>
+          <w:sz w:val="22"/>
+          <w:szCs w:val="22"/>
+        </w:rPr>
+        <w:t xml:space="preserve">, Tilly had put a punctuated, weapon-driven account of state-building at chapter two and praised it from chapter one.</w:t>
+      </w:r>
+    </w:p>
+    <w:p>
+      <w:pPr>
+        <w:spacing w:after="150" w:line="290"/>
+      </w:pPr>
+      <w:r>
+        <w:rPr>
+          <w:rFonts w:ascii="Georgia" w:cs="Georgia" w:eastAsia="Georgia" w:hAnsi="Georgia"/>
+          <w:sz w:val="22"/>
+          <w:szCs w:val="22"/>
+        </w:rPr>
+        <w:t xml:space="preserve">That chapter is Samuel Finer's, "State- and Nation-Building in Europe: The Role of the Military". Finer periodises by weapon ("The Age of Pike and Handgun: 1450–1550"), states the extraction cycle ("More troops — more extraction — more troops", p. 93), names the bastion as the counter ("To counter the new artillery, the tall, thin walls of the medieval castle had to be replaced or girdled by low and thick ones, forerunners of the bastion", p. 105), gives cannon the decisive victories and the constitutional consequence ("Castillon and Formigny — though this was not realized at the time — expelled England from Europe for good", p. 104), and states the French fiscal outcome: "there was no central constitutional organ of opposition to taxation by fist similar to England's and consequently money for the wars could be found more easily in France than across the Channel" (p. 127). Tilly's own summary of him is that the papers show "an alternation of long pauses with giant steps closely following changes in military technology and the scale of war" (pp. 51–52). So the ratchet is substantially in Finer, and Tilly endorsed it. Bean's article, "War and the Birth of the Nation State" (</w:t>
+      </w:r>
+      <w:r>
+        <w:rPr>
+          <w:rFonts w:ascii="Georgia" w:cs="Georgia" w:eastAsia="Georgia" w:hAnsi="Georgia"/>
+          <w:i/>
+          <w:iCs/>
+          <w:sz w:val="22"/>
+          <w:szCs w:val="22"/>
+        </w:rPr>
+        <w:t xml:space="preserve">Journal of Economic History</w:t>
+      </w:r>
+      <w:r>
+        <w:rPr>
+          <w:rFonts w:ascii="Georgia" w:cs="Georgia" w:eastAsia="Georgia" w:hAnsi="Georgia"/>
+          <w:sz w:val="22"/>
+          <w:szCs w:val="22"/>
+        </w:rPr>
+        <w:t xml:space="preserve">, 1973), read in full on 16 September, is closer still: it has the cannon, dated to the middle of the fifteenth century; Normandy, "60 fortified places being reduced in 369 days" (p. 207, a figure he takes from Oman); the fiscal appropriation, "In France in the 1440's and in Spain in the 1480's the rulers were able to seize these taxes as a right and thus dispense with the legislative bodies" (p. 213); the nobility "subordinate to the central governments — the process being largely complete by 1500" (p. 220); and the cascade by which one state's tax power forced its neighbours to centralise or be conquered (p. 220). A reader who knows this article will ask what the book adds to it.</w:t>
+      </w:r>
+    </w:p>
+    <w:p>
+      <w:pPr>
+        <w:spacing w:after="150" w:line="290"/>
+      </w:pPr>
+      <w:r>
+        <w:rPr>
+          <w:rFonts w:ascii="Georgia" w:cs="Georgia" w:eastAsia="Georgia" w:hAnsi="Georgia"/>
+          <w:sz w:val="22"/>
+          <w:szCs w:val="22"/>
+        </w:rPr>
+        <w:t xml:space="preserve">What is left to the book is real but narrower than the drafts assume. First, the explanandum, the thing being explained. Finer's variable is the military format and its style of rule; Bean's is the size and number of states, on a cost curve borrowed from the theory of the firm, so that "States larger than the optimal range tend to disintegrate, and those smaller tend to be absorbed" (p. 204). Tilly's refutation was aimed at size, and Poland and Russia refute it. The book's variable is the irreversibility of a fiscal settlement and the closure of the sub-state path to decisive force inside a surviving polity, which a map cannot refute and only a reversed settlement or a replicated instrument could. Bean's own last paragraph concedes that this question is not his: the changes in war "practically guaranteed" the concentration of power, "However, there was no certainty as to which faction within the nation would control the new centralized state … That task remains a challenge to further research" (p. 221). That is spine §8(g)'s split between mechanism and constitutional form, drawn in 1973. Second, the evidence. Finer's two French paragraphs transpose Castillon and Formigny (p. 104 has Castillon in 1450 and Formigny in 1453), put the Italian campaign at 1484 (p. 127), and carry the tradition that the Estates "had in 1439 voted Charles VII the taille" (p. 127), which Russell Major destroyed in 1960 (see Decision 12); Bean's French evidence is a sentence and a figure from Oman and a misdated militia. The book's is the account books, the Bureau service, the 1442 establishment document and the Normandy census. That is the difference between a hypothesis and a demonstration, not between two hypotheses, and the chapter should say so in those words. Third, Bean's window: he has the offensive advantage lasting from about 1450 until "the second decade of the sixteenth century", after which "the balance was again in favor of the defense" (pp. 207–08). If so, the settlement outlasted the capability that set it by three centuries, which is what irreversibility means, and the chapter should say that too. Bean also formulates the bastion better than the book's present answer to Tilly: after 1525 "the minimum effective scale of fortification was considerably larger … there were many fewer places in Europe after 1525 A.D. with effective fortification" (p. 208), the closure of the sub-state path stated from the defensive face.</w:t>
+      </w:r>
+    </w:p>
+    <w:p>
+      <w:pPr>
+        <w:spacing w:after="150" w:line="290"/>
+      </w:pPr>
+      <w:r>
+        <w:rPr>
+          <w:rFonts w:ascii="Georgia" w:cs="Georgia" w:eastAsia="Georgia" w:hAnsi="Georgia"/>
+          <w:sz w:val="22"/>
+          <w:szCs w:val="22"/>
+        </w:rPr>
+        <w:t xml:space="preserve">One objection in the same 1975 volume is unanswered and flagged. Gabriel Ardant, the French fiscal historian, holds that "Productivity, especially agricultural productivity, and demography were together the first obstacle, a really physical barrier to the power of the state" (p. 176), and that "The ambitions of kings for several centuries ran ahead of the economic structure of their states" (p. 193). On his reading the French settlement of the 1440s should not have held, because the base could not carry it. The book's answer would be that a capability no subject could replicate changed the politics of a fixed base rather than its size, but that answer is not yet written anywhere.</w:t>
       </w:r>
     </w:p>
     <w:p>
@@ -2731,7 +2930,7 @@
           <w:sz w:val="22"/>
           <w:szCs w:val="22"/>
         </w:rPr>
-        <w:t xml:space="preserve"> This is a large point because it protects the claim the book most needs to defend. If "the ratchet" is read as the claim that artillery invented state control of organised force, McNeill refutes it with Venice; if it is read as the claim that only artillery could produce a capital-intensive state monopoly, Glete refutes it with navies; and if Chapter 10 keeps saying the guns won battles, Commynes refutes it with Fornovo. Defined narrowly — as scale, the end of the small sovereign, and the French form of a wider capital-intensity effect — the same three authors become the book's best witnesses, and the fortress objection closes. The Part III question of whether the compute stack behaves like artillery or like a navy is the same question a generation later.</w:t>
+        <w:t xml:space="preserve"> This is a large point because it protects the claim the book most needs to defend, and because it decides what the book may claim for itself. Read as the claim that artillery invented state control of organised force, the ratchet is refuted by McNeill's Venice; read as the claim that only artillery could produce a capital-intensive monopoly, by Glete's navies; if Chapter 10 keeps saying the guns won battles, by Commynes at Fornovo; and read as a new thesis, by a fifty-three-year-old article and a chapter in a volume the book already cites. A specialist who finds Tilly's 1985 verdict, or Finer at chapter two, in an afternoon will treat the book's description of Tilly as diagnostic of the whole. Defined narrowly — as scale, the end of the small sovereign, the French form of a wider capital-intensity effect, and the irreversibility of a settlement rather than the size of states — the same authors become the book's witnesses: McNeill for direction, Glete for breadth, Commynes for the demonstration, Bean for the shape of the thesis, Finer for its respectability, and Tilly's parenthesis about "larger fiscal bases" for the mechanism in miniature. The novelty then rests where it can be defended, on the object and the evidence, and Objection 6 in Chapter 10 becomes "How is this not Bean?", which is a better objection than an invented silence.</w:t>
       </w:r>
     </w:p>
     <w:p>
@@ -2754,33 +2953,64 @@
           <w:sz w:val="22"/>
           <w:szCs w:val="22"/>
         </w:rPr>
-        <w:t xml:space="preserve"> Choice A is the full package. The ratchet is defined narrowly in the spine, as scale and the end of the small sovereign; McNeill is named in Chapters 4, 6 and 10 for the direction of the effect, with one clause conceding that civil control of contracted force was an Italian achievement of the early fifteenth century; the spine glosses "the ratchet" as the artillery-and-taille form of a wider capital-intensity ratchet, and the naval form is stated once, at the close of Chapter 6, as an open question Part III inherits; Commynes enters Chapter 10 section IV by name with the chalk, the eight-hour siege and the Fornovo line quoted with the wet-powder note; and McNeill's fortress answer enters section VII. The cost is a rewritten close of perhaps four hundred words, two or three sentences in each of two other chapters, a gloss in the spine, one sentence conceding that the mechanism is the book's frame and not the witness's, and a small deflation of the artillery claim. It buys the chapter's best evidence and its best discipline from the same volume, a T2 ally for exactly what the book claims, and a sixteenth-century precedent for the bloc prediction.</w:t>
-      </w:r>
-    </w:p>
-    <w:p>
-      <w:pPr>
-        <w:spacing w:after="150" w:line="290"/>
-      </w:pPr>
-      <w:r>
-        <w:rPr>
-          <w:rFonts w:ascii="Georgia" w:cs="Georgia" w:eastAsia="Georgia" w:hAnsi="Georgia"/>
-          <w:sz w:val="22"/>
-          <w:szCs w:val="22"/>
-        </w:rPr>
-        <w:t xml:space="preserve">Choice B takes only the Commynes half: the close gains its eyewitness and the Fornovo concession, while the ratchet stays unqualified and section VII stands. This is cheaper and still raises the grade of the evidence. But the fortress objection stays open, McNeill's Venice and Glete's navies remain uncited contradictions, and Part III inherits an assumption instead of a question.</w:t>
-      </w:r>
-    </w:p>
-    <w:p>
-      <w:pPr>
-        <w:spacing w:after="150" w:line="290"/>
-      </w:pPr>
-      <w:r>
-        <w:rPr>
-          <w:rFonts w:ascii="Georgia" w:cs="Georgia" w:eastAsia="Georgia" w:hAnsi="Georgia"/>
-          <w:sz w:val="22"/>
-          <w:szCs w:val="22"/>
-        </w:rPr>
-        <w:t xml:space="preserve">Choice C keeps everything as drafted. The definite article stays forceful and no gloss interrupts the spine. The cost is that the central mechanism is stated in a form that two T2 works the book has not cited contradict on the page, and that the most quotable medieval demonstration stays one remove from a witness who was there and is in the repository.</w:t>
+        <w:t xml:space="preserve"> Choice A is the full package. The ratchet is defined narrowly in the spine as scale and the end of the small sovereign, glossed as the artillery-and-taille form of a wider capital-intensity ratchet; McNeill is named in Chapters 4, 6 and 10 for direction, with a clause conceding that civil control of contracted force was an Italian achievement; the naval form is stated once at the close of Chapter 6 as an open question Part III inherits; Commynes enters Chapter 10 §IV by name with the chalk, the eight-hour siege and the Fornovo line; McNeill's fortress answer, sharpened by Bean's page 208, enters §VII. And §VII names Finer and Bean in the text as predecessors, concedes the anticipation, corrects the three passages that describe Tilly as silent, rebuilds Objection 6 as "How is this not Bean?", and rests the novelty on the explanandum and the evidence, with Bean's page 221 credited as the 1973 statement of the mechanism-versus-form split. The cost is a rewritten close of five or six hundred words, two or three sentences in each of two other chapters, a gloss in the spine, and a plain admission that the thesis is a descendant and not a discovery. It buys the chapter's best evidence and discipline from one volume, a T2 ally for exactly what the book claims, a sixteenth-century precedent for the bloc prediction, and a differentiation that holds because it is stated at the strength the record allows.</w:t>
+      </w:r>
+    </w:p>
+    <w:p>
+      <w:pPr>
+        <w:spacing w:after="150" w:line="290"/>
+      </w:pPr>
+      <w:r>
+        <w:rPr>
+          <w:rFonts w:ascii="Georgia" w:cs="Georgia" w:eastAsia="Georgia" w:hAnsi="Georgia"/>
+          <w:sz w:val="22"/>
+          <w:szCs w:val="22"/>
+        </w:rPr>
+        <w:t xml:space="preserve">Choice B takes only the Commynes half and the Tilly correction: the close gains its eyewitness and Fornovo, the three Tilly passages are corrected and Bean is cited by name, while the ratchet stays unqualified, §VII stands, and Finer is footnoted. This is cheaper and removes the plainest error. But the fortress objection stays open, McNeill's Venice and Glete's navies remain uncited contradictions, and a reviewer with the 1975 volume will say the book conceded Bean and hid Finer.</w:t>
+      </w:r>
+    </w:p>
+    <w:p>
+      <w:pPr>
+        <w:spacing w:after="150" w:line="290"/>
+      </w:pPr>
+      <w:r>
+        <w:rPr>
+          <w:rFonts w:ascii="Georgia" w:cs="Georgia" w:eastAsia="Georgia" w:hAnsi="Georgia"/>
+          <w:sz w:val="22"/>
+          <w:szCs w:val="22"/>
+        </w:rPr>
+        <w:t xml:space="preserve">Choice C keeps everything as drafted. The definite article stays forceful, no gloss interrupts the spine, and Tilly stays technology-agnostic. The cost is that the central mechanism is stated in a form that two T2 works contradict on the page, that the book's most-cited authority is described in a way the record shows to be wrong, and that its thesis is presented as new when its predecessor is in the </w:t>
+      </w:r>
+      <w:r>
+        <w:rPr>
+          <w:rFonts w:ascii="Georgia" w:cs="Georgia" w:eastAsia="Georgia" w:hAnsi="Georgia"/>
+          <w:i/>
+          <w:iCs/>
+          <w:sz w:val="22"/>
+          <w:szCs w:val="22"/>
+        </w:rPr>
+        <w:t xml:space="preserve">Journal of Economic History</w:t>
+      </w:r>
+      <w:r>
+        <w:rPr>
+          <w:rFonts w:ascii="Georgia" w:cs="Georgia" w:eastAsia="Georgia" w:hAnsi="Georgia"/>
+          <w:sz w:val="22"/>
+          <w:szCs w:val="22"/>
+        </w:rPr>
+        <w:t xml:space="preserve">.</w:t>
+      </w:r>
+    </w:p>
+    <w:p>
+      <w:pPr>
+        <w:spacing w:after="150" w:line="290"/>
+      </w:pPr>
+      <w:r>
+        <w:rPr>
+          <w:rFonts w:ascii="Georgia" w:cs="Georgia" w:eastAsia="Georgia" w:hAnsi="Georgia"/>
+          <w:sz w:val="22"/>
+          <w:szCs w:val="22"/>
+        </w:rPr>
+        <w:t xml:space="preserve">Inside Choice A there are seven sub-choices, all lettered in the 16 September memo. T75-a is the concession itself, whether §VII names Finer, quotes Tilly's pages 51–52 and Finer's page 105, and rests the chapter's novelty on the explanandum and the evidence; this is the heart of A and I have treated it as such. T75-b touches doctrine: Tilly's own formula for what state-makers did to intermediate powers is "abridging, destroying or absorbing rights previously lodged in other political units: manors, communities, provinces, estates" (Tilly 1975, p. 37), and the question is whether that three-verb formula is offered in Chapter 10 §I and in CLAUDE.md §2 beside the book's "suppressing" and "subordinating", since it covers what Chapters 10 and 11 actually document better than either. T75-c is whether Chapter 10 §VI gains Brandenburg-Prussia as a fifth counter-case, at footnote length: the Great Elector's excise of 1680 was "indefinitely expansible", so that "the Elector no longer needed to call the Estates together", and Finer's word for the result is "the euthanasia of the Estates" (p. 138) — a polity where the tax made the assembly redundant without any artillery in the story, which is either a warning that the fisc can do the work alone or the best comparator the fiscal leg has; or §VI stays at four. T75-d is whether §VIII's licence to Part III carries Tilly's warning in the same sentence as the licence and not separately: "our ability to infer the probable events and sequences in contemporary states from an informed reading of European history is close to nil" (p. 82), against his own guarded concession on the same page that some relationships are general. B73-a is whether Bean is named in the text of §VII, with one sentence saying the book's explanandum is not his; B73-b is whether the Bean disanalogy is stated where the bridge to the present is made, since Bean's consolidation reduced the number of polities and the book's predicted consolidation reduces the number of independent holders of decisive capability while leaving the map of polities largely as it is, and the project's rules require every bridge to carry its disanalogy. B73-c is a question for Appendix C, the book's list of measurable leading indicators: whether it gains a window question, how long the compute-led stack's decisive advantage is expected to last, and whether the settlement it induces is claimed to survive the window's closing, as the French one survived Bean's by three centuries. Ardant's ceiling is not a choice but a flag: the objection is unanswered, and whoever rewrites §VII should either write the answer or leave the flag standing where a reviewer will see the book knows it.</w:t>
       </w:r>
     </w:p>
     <w:p>
@@ -2803,7 +3033,7 @@
           <w:sz w:val="22"/>
           <w:szCs w:val="22"/>
         </w:rPr>
-        <w:t xml:space="preserve"> Choice A, and I hold it firmly: every part of the concession is already true on the book's own account, the narrow ratchet is the claim the argument actually needs, and the Fornovo line is what makes the rest of the 1494 close believable.</w:t>
+        <w:t xml:space="preserve"> Choice A, and I hold it firmly: every part of the concession is already true on the book's own account, the narrow ratchet is the claim the argument actually needs, the Fornovo line is what makes the 1494 close believable, and a thesis that names Bean and Finer and shows what it adds to them looks disciplined where one that does not looks either ignorant or evasive. Of the sub-choices, T75-c and B73-c are the two I would take without hesitation, because each turns a predecessor's limitation into the book's own finding.</w:t>
       </w:r>
     </w:p>
     <w:p>
@@ -2920,115 +3150,10 @@
       <w:r>
         <w:rPr>
           <w:rFonts w:ascii="Georgia" w:cs="Georgia" w:eastAsia="Georgia" w:hAnsi="Georgia"/>
-          <w:b/>
-          <w:bCs/>
-          <w:sz w:val="22"/>
-          <w:szCs w:val="22"/>
-        </w:rPr>
-        <w:t xml:space="preserve">The background.</w:t>
-      </w:r>
-      <w:r>
-        <w:rPr>
-          <w:rFonts w:ascii="Georgia" w:cs="Georgia" w:eastAsia="Georgia" w:hAnsi="Georgia"/>
-          <w:sz w:val="22"/>
-          <w:szCs w:val="22"/>
-        </w:rPr>
-        <w:t xml:space="preserve"> The book treats Charles Tilly as having said nothing about guns. The spine, section 8(a), distinguishes the book's claim from his as "not war-made-the-state in general"; Chapter 6, section VII, introduces the main objection as coming "from the historian this chapter has cited more than any other"; and Chapter 10, section VII, Objection 6, describes him as deliberately technology-agnostic. All three treat his position as a silence to be filled.</w:t>
-      </w:r>
-    </w:p>
-    <w:p>
-      <w:pPr>
-        <w:spacing w:after="150" w:line="290"/>
-      </w:pPr>
-      <w:r>
-        <w:rPr>
-          <w:rFonts w:ascii="Georgia" w:cs="Georgia" w:eastAsia="Georgia" w:hAnsi="Georgia"/>
-          <w:sz w:val="22"/>
-          <w:szCs w:val="22"/>
-        </w:rPr>
-        <w:t xml:space="preserve">Read in full for the first time in September, his 1985 essay shows it was a verdict. Tilly summarises a 1973 article by the economic historian Richard Bean, which argued that better fifteenth-century artillery made small forts vulnerable and so made larger armies, standing armies and centralised governments pay. Then he rejects it: "Bean's summary does not stand up to historical scrutiny. As a matter of practice, the shift to infantry-backed artillery sieges of fortified cities occurred only during the sixteenth and seventeenth centuries. Artillery did improve during the fifteenth century, but the invention of new fortifications, especially the trace italienne, rapidly countered the advantage of artillery. The arrival of effective artillery came too late to have caused the increase in the viable size of states. (However, the increased cost of fortifications to defend against artillery did give an advantage to states enjoying larger fiscal bases.)" He adds the naval alternative already discussed in Decision 10. In the same essay he concedes something the book needs: "After 1400 the European pursuit of larger, more permanent, and more costly varieties of military organization did, in fact, drive spectacular increases in princely budgets, taxes, and staffs."</w:t>
-      </w:r>
-    </w:p>
-    <w:p>
-      <w:pPr>
-        <w:spacing w:after="150" w:line="290"/>
-      </w:pPr>
-      <w:r>
-        <w:rPr>
-          <w:rFonts w:ascii="Georgia" w:cs="Georgia" w:eastAsia="Georgia" w:hAnsi="Georgia"/>
-          <w:sz w:val="22"/>
-          <w:szCs w:val="22"/>
-        </w:rPr>
-        <w:t xml:space="preserve">The answer available is on the explanandum — the thing being explained. Bean was explaining the geographic size of states, and Tilly's refutation is aimed there. The book is explaining something else: the closure of the sub-state path to decisive force, and the permanence of the tax that closed it. On the chronology limb, Chapter 6 exists to show what Tilly does not name — the French reduction of Normandy and Guyenne in 1449–53, sixty fortified places in a few seasons. On the fortress limb, his own parenthesis about "larger fiscal bases" is the mechanism in miniature. Bean's article is not yet in the reading and would need to be retrieved.</w:t>
-      </w:r>
-    </w:p>
-    <w:p>
-      <w:pPr>
-        <w:spacing w:after="150" w:line="290"/>
-      </w:pPr>
-      <w:r>
-        <w:rPr>
-          <w:rFonts w:ascii="Georgia" w:cs="Georgia" w:eastAsia="Georgia" w:hAnsi="Georgia"/>
-          <w:b/>
-          <w:bCs/>
-          <w:sz w:val="22"/>
-          <w:szCs w:val="22"/>
-        </w:rPr>
-        <w:t xml:space="preserve">Why it matters.</w:t>
-      </w:r>
-      <w:r>
-        <w:rPr>
-          <w:rFonts w:ascii="Georgia" w:cs="Georgia" w:eastAsia="Georgia" w:hAnsi="Georgia"/>
-          <w:sz w:val="22"/>
-          <w:szCs w:val="22"/>
-        </w:rPr>
-        <w:t xml:space="preserve"> A silence can be filled; a verdict must be answered. The difference matters because Tilly is the book's most-cited authority, and two chapters currently describe his position in a way the record shows to be wrong. A specialist reviewer treats that kind of error as diagnostic of the whole. The correction also improves the book: an objection Tilly actually made, answered with 1449–53, is far better material than an absence.</w:t>
-      </w:r>
-    </w:p>
-    <w:p>
-      <w:pPr>
-        <w:spacing w:after="150" w:line="290"/>
-      </w:pPr>
-      <w:r>
-        <w:rPr>
-          <w:rFonts w:ascii="Georgia" w:cs="Georgia" w:eastAsia="Georgia" w:hAnsi="Georgia"/>
-          <w:b/>
-          <w:bCs/>
-          <w:sz w:val="22"/>
-          <w:szCs w:val="22"/>
-        </w:rPr>
-        <w:t xml:space="preserve">Your choices.</w:t>
-      </w:r>
-      <w:r>
-        <w:rPr>
-          <w:rFonts w:ascii="Georgia" w:cs="Georgia" w:eastAsia="Georgia" w:hAnsi="Georgia"/>
-          <w:sz w:val="22"/>
-          <w:szCs w:val="22"/>
-        </w:rPr>
-        <w:t xml:space="preserve"> Choice A changes the differentiation. The spine sentence becomes something like "Tilly read the artillery thesis in Bean and rejected it on chronology; the book answers on the explanandum", and Chapters 6 and 10 rebuild the objection in its real form, citing Bean 1973, saying plainly that the book is not making Bean's claim, and answering with the census of 1449–50 and the distinction between the size of states and the closure of the sub-state path. It costs one retrieval and a rewritten objection in two chapters. It buys the strongest framing available, because the chapters then answer a named verdict at the one point Tilly never addressed. Choice B leaves the three passages as they stand. Nothing is rewritten, and the book's treatment of its principal authority remains on the record as mistaken.</w:t>
-      </w:r>
-    </w:p>
-    <w:p>
-      <w:pPr>
-        <w:spacing w:after="150" w:line="290"/>
-      </w:pPr>
-      <w:r>
-        <w:rPr>
-          <w:rFonts w:ascii="Georgia" w:cs="Georgia" w:eastAsia="Georgia" w:hAnsi="Georgia"/>
-          <w:b/>
-          <w:bCs/>
-          <w:sz w:val="22"/>
-          <w:szCs w:val="22"/>
-        </w:rPr>
-        <w:t xml:space="preserve">My view.</w:t>
-      </w:r>
-      <w:r>
-        <w:rPr>
-          <w:rFonts w:ascii="Georgia" w:cs="Georgia" w:eastAsia="Georgia" w:hAnsi="Georgia"/>
-          <w:sz w:val="22"/>
-          <w:szCs w:val="22"/>
-        </w:rPr>
-        <w:t xml:space="preserve"> Choice A, and this is the least optional item in the set; the reviewer who knows Tilly will find the 1985 passage in an afternoon.</w:t>
+          <w:sz w:val="22"/>
+          <w:szCs w:val="22"/>
+        </w:rPr>
+        <w:t xml:space="preserve">Folded into Decision 10. The earlier version of this decision said that Bean's 1973 article was not in the corpus and would need to be retrieved; it was read on 16 September, and the same day's reading of the 1975 Tilly volume showed that Finer had anticipated the thesis in the chapter Tilly edited and praised. The Tilly correction, the rebuilding of Chapter 10's Objection 6 as "How is this not Bean?", and the sub-choices B73-a–c are all now inside Decision 10, Choice A. Nothing here is lost; the numbering is kept so the rows can be mapped back.</w:t>
       </w:r>
     </w:p>
     <w:p>
@@ -3119,7 +3244,7 @@
           <w:sz w:val="25"/>
           <w:szCs w:val="25"/>
         </w:rPr>
-        <w:t xml:space="preserve">Decision 12 — Taxes, not credit: what kind of settlement 1439–46 was</w:t>
+        <w:t xml:space="preserve">Decision 12 — Taxes, not credit: what kind of settlement 1439–51 was, and when the Estates General met</w:t>
       </w:r>
     </w:p>
     <w:p>
@@ -3135,7 +3260,7 @@
           <w:sz w:val="19"/>
           <w:szCs w:val="19"/>
         </w:rPr>
-        <w:t xml:space="preserve">Covers rows: (xxx), (ccc), Check 1</w:t>
+        <w:t xml:space="preserve">Covers rows: (xxx), (ccc), Check 1, and M60-a–e (the Major intake of 16 September). Touches spine §8(a).</w:t>
       </w:r>
     </w:p>
     <w:p>
@@ -3158,20 +3283,7 @@
           <w:sz w:val="22"/>
           <w:szCs w:val="22"/>
         </w:rPr>
-        <w:t xml:space="preserve"> Chapter 10, section III, is the book's account of the French fiscal settlement of 1439–46, when the taille — the direct tax on commoners — became permanent to pay for the standing companies and the artillery. The section runs what it calls a control experiment: "At the Estates of Tours in 1484 — the first Estates General in decades, meeting over a royal minority — the assembled realm asserted itself: the taille was granted for two years only and cut to some 1.5 million. The machine absorbed the cut, outlived the assertion, and no Estates General met again until 1560." Later in the section the assemblies are described as "not summoned again for nearly forty years", and the section closes by calling the French case "the coupling's first full demonstration". Chapter 4, section VII, and Chapter 10 together lean on a phrase about consolidation moving "fastest where the fisc is deepest". The spine's section 8(a) states flatly that "No Estates General met again until 1484".</w:t>
-      </w:r>
-    </w:p>
-    <w:p>
-      <w:pPr>
-        <w:spacing w:after="150" w:line="290"/>
-      </w:pPr>
-      <w:r>
-        <w:rPr>
-          <w:rFonts w:ascii="Georgia" w:cs="Georgia" w:eastAsia="Georgia" w:hAnsi="Georgia"/>
-          <w:sz w:val="22"/>
-          <w:szCs w:val="22"/>
-        </w:rPr>
-        <w:t xml:space="preserve">Two new arrivals bear on this. David Stasavage, an American political scientist, in </w:t>
+        <w:t xml:space="preserve"> Chapter 10, section III, is the book's account of the French fiscal settlement of the 1440s, when the taille — the direct tax on commoners — became permanent to pay for the standing companies and the artillery. The section runs what it calls a control experiment: "At the Estates of Tours in 1484 — the first Estates General in decades, meeting over a royal minority — the assembled realm asserted itself: the taille was granted for two years only and cut to some 1.5 million. The machine absorbed the cut, outlived the assertion, and no Estates General met again until 1560." Later in the section the assemblies are described as "not summoned again for nearly forty years", and the section closes by calling the French case "the coupling's first full demonstration". Chapter 4 §VII and Chapter 10 together lean on a phrase about consolidation moving "fastest where the fisc is deepest". The spine's section 8(a) states flatly that "No Estates General met again until 1484". The earlier version of this decision said the 1468 meeting was "pending Major 1960". It is not pending. J. Russell Major's </w:t>
       </w:r>
       <w:r>
         <w:rPr>
@@ -3181,6 +3293,37 @@
           <w:sz w:val="22"/>
           <w:szCs w:val="22"/>
         </w:rPr>
+        <w:t xml:space="preserve">Representative Institutions in Renaissance France, 1421–1559</w:t>
+      </w:r>
+      <w:r>
+        <w:rPr>
+          <w:rFonts w:ascii="Georgia" w:cs="Georgia" w:eastAsia="Georgia" w:hAnsi="Georgia"/>
+          <w:sz w:val="22"/>
+          <w:szCs w:val="22"/>
+        </w:rPr>
+        <w:t xml:space="preserve"> (Wisconsin, 1960) was read on 16 September, and it does three things to this section, one of which reaches the spine.</w:t>
+      </w:r>
+    </w:p>
+    <w:p>
+      <w:pPr>
+        <w:spacing w:after="150" w:line="290"/>
+      </w:pPr>
+      <w:r>
+        <w:rPr>
+          <w:rFonts w:ascii="Georgia" w:cs="Georgia" w:eastAsia="Georgia" w:hAnsi="Georgia"/>
+          <w:sz w:val="22"/>
+          <w:szCs w:val="22"/>
+        </w:rPr>
+        <w:t xml:space="preserve">Take the settled matter first. David Stasavage, an American political scientist, in </w:t>
+      </w:r>
+      <w:r>
+        <w:rPr>
+          <w:rFonts w:ascii="Georgia" w:cs="Georgia" w:eastAsia="Georgia" w:hAnsi="Georgia"/>
+          <w:i/>
+          <w:iCs/>
+          <w:sz w:val="22"/>
+          <w:szCs w:val="22"/>
+        </w:rPr>
         <w:t xml:space="preserve">States of Credit</w:t>
       </w:r>
       <w:r>
@@ -3189,20 +3332,59 @@
           <w:sz w:val="22"/>
           <w:szCs w:val="22"/>
         </w:rPr>
-        <w:t xml:space="preserve"> (Princeton, 2011), is the standard quantitative account of who in Europe could borrow long-term. A funded debt is a loan secured on a named tax and paid to bondholders indefinitely; Stasavage's finding is that only small city-states could sustain one, because only a city could keep an assembly of creditors sitting often enough to watch the money. His table dates the first long-term loans to Arras in 1241 and Venice in 1262, and the first by a territorial state to Castile in 1489 and France in 1522. "Prior to 1500, we cannot directly compare city-states and territorial states, because no territorial states had yet created long-term debts", and "territorial rulers did not establish a long-term debt earlier because no one was willing to lend to them on such terms". So the French settlement ran seventy-six years without the instrument that "depth of fisc" would normally mean. His own Dutch case supports your ordering rather than undercutting it: the Dutch revolt "was first and foremost a tax revolution… it was only after this point that borrowing became a major source of war finance". He also records, reporting Wim Blockmans, a French Estates meeting in 1468: "At the conclusion to the 1468 meeting, the assembled Estates actually stated that they could not meet as frequently as in the past". Ertman gives the same shape from the other side: the crown "after 1440" abandoned "its policy of frequent convocations" (p. 92), Tours extracted a promise of another meeting in two years that was never kept, and "a full, working Estates General was not to meet again until 1560" (pp. 92–93). The page in Russell Major's 1960 book where the 1468 meeting would be confirmed has not been consulted.</w:t>
-      </w:r>
-    </w:p>
-    <w:p>
-      <w:pPr>
-        <w:spacing w:after="150" w:line="290"/>
-      </w:pPr>
-      <w:r>
-        <w:rPr>
-          <w:rFonts w:ascii="Georgia" w:cs="Georgia" w:eastAsia="Georgia" w:hAnsi="Georgia"/>
-          <w:sz w:val="22"/>
-          <w:szCs w:val="22"/>
-        </w:rPr>
-        <w:t xml:space="preserve">Commynes, the eyewitness of Decision 10, supplies the numbers. Charles VIII resolved in 1498 to take no more than "douze cens mil frans et par forme de taille, oultre son domayne, qui estoit la somme que les trois Estatz luy avoyent accordée à Tours" — 1.2 million francs by way of taille, beyond his domain revenue, the sum the three Estates had granted him at Tours — while "le peuple, qui paie au jour d'uy plus de deux milions et demy de francs de taille" — the people, who today pay more than two and a half million (p. 304). This does not flatly contradict the draft's 1.5 million, which presumably includes a grant above the taille proper, but the primary says 1.2 by way of taille and the two must be reconciled with the primary pinned.</w:t>
+        <w:t xml:space="preserve"> (Princeton, 2011), is the standard quantitative account of who in Europe could borrow long-term. A funded debt is a loan secured on a named tax and paid to bondholders indefinitely; his finding is that only small city-states could sustain one before 1500, because only a city could keep an assembly of creditors sitting often enough to watch the money. His table dates the first long-term loans to Arras in 1241 and Venice in 1262, the first by a territorial state to Castile in 1489 and France in 1522. "Prior to 1500, we cannot directly compare city-states and territorial states, because no territorial states had yet created long-term debts." So the French settlement ran seventy-six years without the instrument that "depth of fisc" would normally mean. His Dutch case supports your ordering: the Dutch revolt "was first and foremost a tax revolution … it was only after this point that borrowing became a major source of war finance". Commynes, the eyewitness of Decision 10, supplies the 1484 numbers from the other end: Charles VIII resolved in 1498 to take no more than "douze cens mil frans et par forme de taille, oultre son domayne, qui estoit la somme que les trois Estatz luy avoyent accordée à Tours", while "le peuple, qui paie au jour d'uy plus de deux milions et demy de francs de taille" (Calmette III, p. 304).</w:t>
+      </w:r>
+    </w:p>
+    <w:p>
+      <w:pPr>
+        <w:spacing w:after="150" w:line="290"/>
+      </w:pPr>
+      <w:r>
+        <w:rPr>
+          <w:rFonts w:ascii="Georgia" w:cs="Georgia" w:eastAsia="Georgia" w:hAnsi="Georgia"/>
+          <w:sz w:val="22"/>
+          <w:szCs w:val="22"/>
+        </w:rPr>
+        <w:t xml:space="preserve">Now Major. His first finding is the spine sentence. His appendix, "Assemblies of the Estates General and the Estates of Languedoil, 1421–1615" (pp. 151–52), marks every doubtful assembly with a query symbol. Between the Orléans meeting of 1439 and Tours in 1484 it lists an Estates General at Tours in April 1468 with no query. His chapter on it (pp. 54–58) gives the detail: letters of convocation on 26 February 1468; town deputies "named in general assemblies of the inhabitants" (p. 54); present, "five of the six peers of the church … and nineteen other archbishops and bishops", "over twenty-four nobles", and "the clerical and lay deputies from sixty-four towns; they must have numbered close to two hundred" (p. 55). He expressly denies it was managed: "There is no real proof that either Louis XI or the rebellious nobles tampered with the elections in the towns … The oft-quoted statement of Commynes that Louis summoned whom he wished does not apply to the estates of 1468" (p. 55). Its business was Normandy, Brittany and England; its output was recommendations, "all that Louis could have wished" (p. 57); and no tax was granted. So "No Estates General met again until 1484" does not survive: the gaps are 1440 to 1468, twenty-eight years, and 1468 to 1484, sixteen. Chapter 10 §III's "nearly forty years" fails with it. So does "no Estates General met again until 1560", because the same appendix lists May 1506 at Tours and January 1558 at Paris as restricted Estates General, assemblies to which only a limited number of clergy, nobles and town deputies were summoned, and Major gives the 1558 meeting its own section, at which the clergy offered 2,300,000 livres and the towns 4,600,000 (p. 147). Ertman's formula, "a full, working Estates General was not to meet again until 1560" (pp. 92–93), is the defensible one; the draft dropped the qualifier. What survives, and survives intact, is the substance: 1468 granted nothing; 1484's grant was breached within months; and "There is no evidence of any move to force the promised convocation of the Estates General by the refusal to vote taxes or by any other means" (p. 116).</w:t>
+      </w:r>
+    </w:p>
+    <w:p>
+      <w:pPr>
+        <w:spacing w:after="150" w:line="290"/>
+      </w:pPr>
+      <w:r>
+        <w:rPr>
+          <w:rFonts w:ascii="Georgia" w:cs="Georgia" w:eastAsia="Georgia" w:hAnsi="Georgia"/>
+          <w:sz w:val="22"/>
+          <w:szCs w:val="22"/>
+        </w:rPr>
+        <w:t xml:space="preserve">His second finding is the 1484 figures, and it reconciles the draft with the primary. The Estates offered 1,200,000 livres for two years; the council announced in August 1484 that the taille for 1485 would be 1,500,000 "in spite of the fact the Estates General had granted only 1,200,000 livres for that year" (p. 115), and returned to 1,500,000 for 1486 though "the Estates General had made no offer at all for that year" (p. 115). The cut was from 4,400,000 levied under Louis XI, and "Perhaps no French government ever went further to meet the desires of the people" (p. 100). Commynes's 1.2 million "par forme de taille" is the grant; the draft's 1.5 million is the levy; the draft has conflated them, and the corrected sentence reads: granted 1,200,000 for two years, levied 1,500,000, down from 4,400,000.</w:t>
+      </w:r>
+    </w:p>
+    <w:p>
+      <w:pPr>
+        <w:spacing w:after="150" w:line="290"/>
+      </w:pPr>
+      <w:r>
+        <w:rPr>
+          <w:rFonts w:ascii="Georgia" w:cs="Georgia" w:eastAsia="Georgia" w:hAnsi="Georgia"/>
+          <w:sz w:val="22"/>
+          <w:szCs w:val="22"/>
+        </w:rPr>
+        <w:t xml:space="preserve">His third finding is the largest, because it is about the book's founding date. The textbook story is that the Estates of 1439 consented to a permanent army and a permanent taille, freeing the king from consent thereafter. Chapter 10 §III already holds that story "at tertiary strength". Major goes further: "A completely erroneous theory has developed that the estates at this time consented to the creation of a permanent standing army and voted a permanent taille for its support … it contains scarcely a word of truth, as Antoine Thomas pointed out as early as 1878" (pp. 32–33). Of the 1439 act: "The purpose of these articles was to restore discipline, not to create a permanent army" (p. 33), and "Nothing whatsoever was said about a permanent taille, and only 100,000 livres were voted" (p. 34). What actually closed consent, on his account, happened in two steps inside the artillery years. The aides, the indirect taxes, were converted province by province after 1440 and then "collected without further consultation with the estates" (p. 40). Then in 1451 Charles VII abolished the regular taille as a tax cut and kept only the taille des gens de guerre, the tax for the soldiers: "the king ordered the élus to impose the necessary taxes to support the lances without convoking the provincial estates to give consent. The taille to support the army, like the aides some years earlier, had come to be levied by royal command alone" (p. 42). That is two years into the Normandy campaign and two years before Castillon, and it was done by reducing the burden by a third, not by force. He also supplies the king's own words, from the reply to the rebel nobles in 1442: "it is not necessary to assemble the three estates to levy the tailles because it is only a burden and an expense to the poor common people who have to pay the cost of those who attend" (pp. 34–35), which is the draft's "It was simply not consulted, year after year, until non-consultation was the constitution" said by the man who did it. And a hard number: in 1461, 58 per cent of royal income came from the taille, and "As long as the estates controlled this tax, the crown could not become financially independent" (p. 32).</w:t>
+      </w:r>
+    </w:p>
+    <w:p>
+      <w:pPr>
+        <w:spacing w:after="150" w:line="290"/>
+      </w:pPr>
+      <w:r>
+        <w:rPr>
+          <w:rFonts w:ascii="Georgia" w:cs="Georgia" w:eastAsia="Georgia" w:hAnsi="Georgia"/>
+          <w:sz w:val="22"/>
+          <w:szCs w:val="22"/>
+        </w:rPr>
+        <w:t xml:space="preserve">Two further things Major says cut against the chapter and must be recorded. The Estates General lapsed, on his reading, not because of the guns but because the provinces would not attend and the crown found it "no longer necessary" (p. 36), and the lapse dates from 1440, before the guns and independent of them; indeed "it was far more difficult for Charles to control the deliberations of the provincial estates and the towns than those of the Estates General" (p. 38), so abandoning the national assembly was no victory. The ratchet's object must therefore be the provincial estates and the magnates, not the Estates General. And he denies the inference from the standing army to subordination with arithmetic: two thousand lances and sixteen thousand francs-archers, "less than two modern divisions", could "hardly subject a population of 15,000,000 persons" (p. 9); the towns "had comparable forces equipped with artillery and munitions" (p. 9); and "The compagnies d'ordonnance were composed almost entirely of the local nobility and captained by members of the leading families of the provinces" (p. 9). Finally, a counter-instance on the book's own ground: in 1458, five years after Castillon, in the very province the siege train had reconquered, the king "committed himself to first winning the approval of the three estates of the duchy" of Normandy, whose estates then met every year "for nearly two centuries" (p. 44); and where consent survived, in Normandy and Languedoc, the taille per hearth was roughly three times what it was in the provinces that had lost it (p. 42).</w:t>
       </w:r>
     </w:p>
     <w:p>
@@ -3225,7 +3407,7 @@
           <w:sz w:val="22"/>
           <w:szCs w:val="22"/>
         </w:rPr>
-        <w:t xml:space="preserve"> Three things of rising weight. The figures are a plain accuracy point where a primary now outranks the flagged secondary the draft uses. The "nearly forty years" clause and the spine's "until 1484" are a factual exposure: if an Estates met in 1468, both are wrong as written, and the spine sentence is licensed to appear anywhere. The largest is Stasavage's whole apparatus, which is aimed at war-and-state-formation arguments: a specialist will ask whether the chapter claims a fiscal-military state for a polity that had no funded debt for three generations. The answer is that your mechanism was never a credit mechanism — the chain runs weapon, permanent taxation, administration, subordination, and the transaction was the taille collected, not a bond sold — but the chapter never says so, and the omission reads as oversight.</w:t>
+        <w:t xml:space="preserve"> Four things of rising weight, and the last touches spine §8(a) directly, so this is now one of the largest decisions on the sheet. The 1484 figures are a plain accuracy point, now settled by a T2 and a T1 that agree. The "nearly forty years", "until 1484" and "until 1560" clauses are a factual exposure of the simplest kind: a reviewer opens Major's appendix and finds 1468, 1506 and 1558. Stasavage's apparatus is aimed at war-and-state-formation arguments, and a specialist will ask whether the chapter claims a fiscal-military state for a polity with no funded debt for three generations; the answer is that your mechanism was never a credit mechanism, but the chapter never says so. And the hinge: the book currently dates its French settlement to 1439–46 on a tradition that the standard authority on French representative institutions called "scarcely a word of truth" sixty-six years ago, when the same authority offers 1451, inside the artillery years, as the point at which the army's tax came to be "levied by royal command alone". That is better for the book than 1439, because it puts the decisive step between the Normandy census and Castillon; but it is a change to the founding date, and Major's own explanation of it is a tax cut and provincial particularism, not a siege train. His army-too-small objection is the same objection Ertman made, from a source thirty-seven years older, and the book's answer, that the crown held the artillery arm as a department of state while the cavalry arm remained a patronage instrument shared with the nobility, is not yet said out loud.</w:t>
       </w:r>
     </w:p>
     <w:p>
@@ -3248,7 +3430,20 @@
           <w:sz w:val="22"/>
           <w:szCs w:val="22"/>
         </w:rPr>
-        <w:t xml:space="preserve"> Choice A is the full correction. The 1484 figures are re-based on Commynes p. 304, with 1.2 million granted and more than 2.5 million paid by 1498 quoted — which strengthens the control experiment, because the primary now proves the rebound. Section III gains one or two sentences saying in terms that this was a tax settlement and not a credit one, with Stasavage named, the seventy-six years conceded, France's first funded debt of 1522 placed by the Paris route, and the observation his own regressions support that the assemblies France dispensed with were useless for credit anyway. The phrase "fastest where the fisc is deepest" becomes "the capacity to tax at scale" in both chapters. And "nearly forty years" and the spine's "until 1484" are replaced with Ertman's qualified form — frequent convocation abandoned after 1440, 1468 named, no full working Estates until 1560 — with the Major check left to refine rather than rescue. It costs perhaps a hundred and fifty words, one verification errand, and a phrase. It buys a paragraph a quantitative historian cannot dent. Choice B holds the paragraph as drafted and logs Stasavage in the chapter's critiques file only, with the spine sentence marked unverified pending Major. The section keeps its momentum; "first full demonstration" sits unqualified in a chapter that never says which leg of public finance it demonstrates; the 1.5 million stays on its flagged pin while the repository holds a primary saying 1.2.</w:t>
+        <w:t xml:space="preserve"> Choice A is the full correction. Spine §8(a)'s sentence is reworded to Ertman's qualified form: frequent convocation abandoned after 1440, 1468 named as an Estates General that granted no tax, 1484's grant breached within months, no full working Estates General until 1560. Chapter 10 §III drops "nearly forty years" and "until 1560" for the same form; re-bases the 1484 figures on Major and Commynes, granted 1,200,000 for two years, levied 1,500,000, down from 4,400,000, with more than 2,500,000 paid by 1498; gains one or two sentences saying in terms that this was a tax settlement and not a credit one, with Stasavage named and France's first funded debt of 1522 placed; and replaces "fastest where the fisc is deepest" with "the capacity to tax at scale" in both chapters. It costs perhaps two hundred and fifty words, one adjective in the spine, and the surrender of a neat number. It buys a paragraph a quantitative historian cannot dent and a spine sentence that survives its own appendix. Choice B holds the paragraph as drafted and logs Major and Stasavage in the chapter's critiques file only. The section keeps its momentum; the spine keeps a sentence that a published table contradicts; the 1.5 million stays unexplained against a primary and a T2 that both say 1.2 was granted; and "first full demonstration" sits unqualified in a chapter that never says which leg of public finance it demonstrates. I do not think B is available for the spine sentence at all, and the Major intake marked that sub-choice as yours.</w:t>
+      </w:r>
+    </w:p>
+    <w:p>
+      <w:pPr>
+        <w:spacing w:after="150" w:line="290"/>
+      </w:pPr>
+      <w:r>
+        <w:rPr>
+          <w:rFonts w:ascii="Georgia" w:cs="Georgia" w:eastAsia="Georgia" w:hAnsi="Georgia"/>
+          <w:sz w:val="22"/>
+          <w:szCs w:val="22"/>
+        </w:rPr>
+        <w:t xml:space="preserve">Inside Choice A there are five sub-choices, lettered M60-a to M60-e. M60-a is the spine sentence itself, reworded or retired on the 1468 evidence, with §III's two clauses corrected to match; the memo marks this as Roderick's, and I have treated it above as the one part of A that cannot be declined. M60-b is the hinge: whether §III adds 1451, the taille des gens de guerre levied by royal command alone (Major, p. 42), to the 1439, 1445, 1446 and c. 1450 sequence, and whether the ratchet's object is restated as the provincial estates and the magnates rather than the Estates General, which had lapsed for reasons the book does not claim. Taking it means the settlement is dated by the closure of consent in the provinces rather than by a grant that Major says was never made; declining it means the chapter keeps a founding date that its own principal revisionist has demolished and that Finer, in Decision 10, repeated carelessly. M60-c is the 1484 figures, already stated above; the correction is mechanical and I can see no reason to decline it. M60-d is whether §VII answers Major by name on the army-too-small objection, distinguishing the siege train from the companies and conceding that the companies were officered by the provincial nobility, a concession Chapter 10's memo already recorded from Ertman; the alternative is to leave the objection to the critiques file, where a reviewer holding Major's page 9 will not find it. M60-e is whether §III or §VI carries Normandy 1458, consent conceded after the reconquest and kept for two centuries, as the book's own evidence that the mechanism does not determine the constitutional form, which is exactly the point spine §8(g) makes for the present; or declines it with a reason. It is the strongest medieval demonstration available that the same mechanism produced both branches inside one kingdom, and it is not currently in the chapter.</w:t>
       </w:r>
     </w:p>
     <w:p>
@@ -3271,7 +3466,7 @@
           <w:sz w:val="22"/>
           <w:szCs w:val="22"/>
         </w:rPr>
-        <w:t xml:space="preserve"> Choice A is not close: the tax-not-credit sentence costs almost nothing and pre-empts the single most likely specialist objection to Part II's centrepiece, and I would not let "nearly forty years" or "until 1484" go to press in either place before Major has been read.</w:t>
+        <w:t xml:space="preserve"> Choice A with all five sub-choices, and this is not close: the spine sentence is false as written and a published appendix says so; the 1484 figures now have a primary and a T2 in agreement; the tax-not-credit sentence costs almost nothing and pre-empts the likeliest specialist objection to Part II's centrepiece; and 1451 is a better hinge than 1439 because it is true, it is inside the artillery years, and it is Major's, which means the chapter's principal revisionist supplies its founding date. I would take Normandy 1458 for the same reason I would take Bean's closing paragraph in Decision 10: it makes the mechanism-versus-form split look like the shape the evidence has always had rather than a hedge the book adopted in September.</w:t>
       </w:r>
     </w:p>
     <w:p>
@@ -8036,6 +8231,1045 @@
           <w:szCs w:val="22"/>
         </w:rPr>
         <w:t xml:space="preserve">Five corrections are owed to the master retrieval ledger, retrieval-master.md, which the Lepore intake unit was not permitted to edit. The Part Two opener is "What Robots Want" at printed pages 117 to 130. The Epilogue runs printed pages 225 to 228, and the main text ends at printed page 228 (PDF page 246), not "about printed page 237" as the ledger has it. The Acknowledgments are at PDF page 247 and the Notes title page at PDF page 249 (printed page 231), with printed page 232 confirmed at PDF page 250. Finally, the search claim for CHIPS, chip and export control is "zero in the main text" only; the words occur in an endnote quotation at printed page 256 (PDF pages 274 to 275).</w:t>
+      </w:r>
+    </w:p>
+    <w:p>
+      <w:pPr>
+        <w:pStyle w:val="Heading1"/>
+        <w:pageBreakBefore/>
+        <w:spacing w:after="200" w:before="0"/>
+      </w:pPr>
+      <w:r>
+        <w:rPr>
+          <w:rFonts w:ascii="Georgia" w:cs="Georgia" w:eastAsia="Georgia" w:hAnsi="Georgia"/>
+          <w:b/>
+          <w:bCs/>
+          <w:color w:val="1F3864"/>
+          <w:sz w:val="32"/>
+          <w:szCs w:val="32"/>
+        </w:rPr>
+        <w:t xml:space="preserve">Part Nine — Executing two earlier rulings, and the account books</w:t>
+      </w:r>
+    </w:p>
+    <w:p>
+      <w:pPr>
+        <w:pStyle w:val="Heading2"/>
+        <w:spacing w:after="120" w:before="260"/>
+      </w:pPr>
+      <w:r>
+        <w:rPr>
+          <w:rFonts w:ascii="Georgia" w:cs="Georgia" w:eastAsia="Georgia" w:hAnsi="Georgia"/>
+          <w:b/>
+          <w:bCs/>
+          <w:color w:val="1F3864"/>
+          <w:sz w:val="25"/>
+          <w:szCs w:val="25"/>
+        </w:rPr>
+        <w:t xml:space="preserve">Decision 29 — Cadillac and Castillon, as Leseur has them</w:t>
+      </w:r>
+    </w:p>
+    <w:p>
+      <w:pPr>
+        <w:spacing w:after="140"/>
+      </w:pPr>
+      <w:r>
+        <w:rPr>
+          <w:rFonts w:ascii="Georgia" w:cs="Georgia" w:eastAsia="Georgia" w:hAnsi="Georgia"/>
+          <w:i/>
+          <w:iCs/>
+          <w:color w:val="777777"/>
+          <w:sz w:val="19"/>
+          <w:szCs w:val="19"/>
+        </w:rPr>
+        <w:t xml:space="preserve">Covers rows: L-a, L-b, L-c, L-d, L-e, L-f, L-g, L-h, L-i, L-j; the chapter 6 [RE-CHECK AT PRESS] flag on Cadillac; executes your "resolve" ruling of 16 September on row R7</w:t>
+      </w:r>
+    </w:p>
+    <w:p>
+      <w:pPr>
+        <w:spacing w:after="150" w:line="290"/>
+      </w:pPr>
+      <w:r>
+        <w:rPr>
+          <w:rFonts w:ascii="Georgia" w:cs="Georgia" w:eastAsia="Georgia" w:hAnsi="Georgia"/>
+          <w:b/>
+          <w:bCs/>
+          <w:sz w:val="22"/>
+          <w:szCs w:val="22"/>
+        </w:rPr>
+        <w:t xml:space="preserve">The background.</w:t>
+      </w:r>
+      <w:r>
+        <w:rPr>
+          <w:rFonts w:ascii="Georgia" w:cs="Georgia" w:eastAsia="Georgia" w:hAnsi="Georgia"/>
+          <w:sz w:val="22"/>
+          <w:szCs w:val="22"/>
+        </w:rPr>
+        <w:t xml:space="preserve"> On 16 September you ruled one word on row R7, "Cadillac's storming": resolve. The row asked whether chapter 6 could keep calling Cadillac "the only storming in the record", and your answer was that the claim stands only once the sources have been settled. The sources have now been read, and this decision is the execution of that ruling. What made it possible is Guillaume Leseur's </w:t>
+      </w:r>
+      <w:r>
+        <w:rPr>
+          <w:rFonts w:ascii="Georgia" w:cs="Georgia" w:eastAsia="Georgia" w:hAnsi="Georgia"/>
+          <w:i/>
+          <w:iCs/>
+          <w:sz w:val="22"/>
+          <w:szCs w:val="22"/>
+        </w:rPr>
+        <w:t xml:space="preserve">Histoire de Gaston IV, comte de Foix</w:t>
+      </w:r>
+      <w:r>
+        <w:rPr>
+          <w:rFonts w:ascii="Georgia" w:cs="Georgia" w:eastAsia="Georgia" w:hAnsi="Georgia"/>
+          <w:sz w:val="22"/>
+          <w:szCs w:val="22"/>
+        </w:rPr>
+        <w:t xml:space="preserve">, a fifteenth-century chronicle written by the count's household servant of thirty years, in Henri Courteault's two-volume edition of 1893 to 1896. It was sitting in the repository and entered nowhere. In the book's grading it is T1, a primary source in a scholarly edition; Courteault's notes beneath it are T2, the work of a modern scholar, and in places the more useful half.</w:t>
+      </w:r>
+    </w:p>
+    <w:p>
+      <w:pPr>
+        <w:spacing w:after="150" w:line="290"/>
+      </w:pPr>
+      <w:r>
+        <w:rPr>
+          <w:rFonts w:ascii="Georgia" w:cs="Georgia" w:eastAsia="Georgia" w:hAnsi="Georgia"/>
+          <w:sz w:val="22"/>
+          <w:szCs w:val="22"/>
+        </w:rPr>
+        <w:t xml:space="preserve">Chapter 6, section VI, currently says of the 1453 mopping-up that "Cadillac, held against the king after the revolt, is the only place in the whole record taken by storm through a breach", that the storm was "a bombardment wearing an assault's clothes", and that "it was reserved for a place under punitive terms, whose captain the king had executed", with a flag recording that Michael Vale dates the execution 17 September and the chronicler Escouchy dates the storm 19 September. Leseur adjudicates this. The town was carried by storm after Jean Bureau, the crown's master of artillery, "faisoit tyrer l'artillerie jour et nuyt, tant la grosse que la menue" — kept the guns firing night and day, great and small (tome II, p. 24). The castle composed the next day. The garrison were taken prisoner, except the captain, Gaillardet, who "se rendit à la volunté de mondit sieur de Foix" — surrendered to the count of Foix's will — and whom the count "pour ses desmerites luy fist trencher la teste comme à ung traystre", had beheaded as a traitor for his misdeeds, because he was the count's own perjured liegeman (tome II, pp. 25–26). Courteault adds that at the moment Cadillac capitulated "Charles VII était devant Bordeaux" (p. 22 n. 2). So Escouchy is right on the mode and the date and wrong on the command: Courteault says of his attributing the siege to Dunois, "c'est une erreur" (p. 22 n. 2). Hall's 27 September, which the evidence file had treated as a third date for Cadillac, is the fall of Bénauges, a different place. And Vale's sentence, "on his arrival at the place, they surrendered", is the reverse of what stands at the page he cites: tome II, p. 19 carries the aftermath of Castillon, and on Gaston's arrival Cadillac did not surrender. No date for the storm appears anywhere in Leseur's narrative, which is why the flag can be narrowed but not closed: the 17 September date stays for press.</w:t>
+      </w:r>
+    </w:p>
+    <w:p>
+      <w:pPr>
+        <w:spacing w:after="150" w:line="290"/>
+      </w:pPr>
+      <w:r>
+        <w:rPr>
+          <w:rFonts w:ascii="Georgia" w:cs="Georgia" w:eastAsia="Georgia" w:hAnsi="Georgia"/>
+          <w:sz w:val="22"/>
+          <w:szCs w:val="22"/>
+        </w:rPr>
+        <w:t xml:space="preserve">Leseur also corrects and adds around Castillon itself. The draft says "The town of Castillon surrendered two days later under the continuing fire"; Leseur has "troys jours après" (tome II, p. 19), and Courteault's note dates the capitulation to 20 July, three days after the battle of the 17th. The draft attributes the false report that drew Talbot out of Bordeaux to camp-followers on the move; Leseur has the garrison inside the town send to Talbot that the French were loading their guns to flee (p. 16), and Courteault prefers his version to Escouchy's (p. 14 n. 2). And Leseur, who was not at the battle, credits the decision to a charge of fresh Breton cavalry after an hour of hand-to-hand fighting, not to the guns (pp. 17–18); the intake grades this a real qualification the chapter must carry in the text rather than in a note. Three further passages are on offer for other sections: Dunois's empty field at Fronsac in 1451, held all day for an English relief that never came, after which "toutes les villes et places, réservé Bayonne" composed (tome I, p. 205); Bureau and the finance general Le Boursier left behind to begin the citadels of Hâ and Trompette at Bordeaux (tome II, p. 29), with the royal muster and 10,000 francs paid to the count of Foix's private levy from Courteault's notes (p. 8 n. 1); and the storm and sack of Blaye in 1451 (tome I, p. 202). Two cautions travel with all of it. Courteault calls Leseur a panegyrist who "grossit volontiers les chiffres", inflates figures readily, and says no chronicler stands in greater need of correction from the documents. And Courteault's own notes disagree about which Cadillac is meant, the one on the Garonne or the one in the Fronsadais; that question is newly open.</w:t>
+      </w:r>
+    </w:p>
+    <w:p>
+      <w:pPr>
+        <w:spacing w:after="150" w:line="290"/>
+      </w:pPr>
+      <w:r>
+        <w:rPr>
+          <w:rFonts w:ascii="Georgia" w:cs="Georgia" w:eastAsia="Georgia" w:hAnsi="Georgia"/>
+          <w:b/>
+          <w:bCs/>
+          <w:sz w:val="22"/>
+          <w:szCs w:val="22"/>
+        </w:rPr>
+        <w:t xml:space="preserve">Why it matters.</w:t>
+      </w:r>
+      <w:r>
+        <w:rPr>
+          <w:rFonts w:ascii="Georgia" w:cs="Georgia" w:eastAsia="Georgia" w:hAnsi="Georgia"/>
+          <w:sz w:val="22"/>
+          <w:szCs w:val="22"/>
+        </w:rPr>
+        <w:t xml:space="preserve"> This is a medium point with one large consequence. The chapter's census of 1449 to 1453 rests on the claim that places fell to composition, not to storm, and Cadillac is its stated single exception; a hostile reviewer who opened Leseur would find the exception mis-commanded, mis-dated and mis-executed in the draft, and would use it to doubt the census. The Breton charge is the sharper danger: the book's cleanest exhibit of artillery decisiveness has a primary witness who gives the day to cavalry, and a chapter that does not say so invites the accusation that it read only the sources that agreed with it. Everything else here is precision the chapter gains for nothing.</w:t>
+      </w:r>
+    </w:p>
+    <w:p>
+      <w:pPr>
+        <w:spacing w:after="150" w:line="290"/>
+      </w:pPr>
+      <w:r>
+        <w:rPr>
+          <w:rFonts w:ascii="Georgia" w:cs="Georgia" w:eastAsia="Georgia" w:hAnsi="Georgia"/>
+          <w:b/>
+          <w:bCs/>
+          <w:sz w:val="22"/>
+          <w:szCs w:val="22"/>
+        </w:rPr>
+        <w:t xml:space="preserve">Your choices.</w:t>
+      </w:r>
+      <w:r>
+        <w:rPr>
+          <w:rFonts w:ascii="Georgia" w:cs="Georgia" w:eastAsia="Georgia" w:hAnsi="Georgia"/>
+          <w:sz w:val="22"/>
+          <w:szCs w:val="22"/>
+        </w:rPr>
+        <w:t xml:space="preserve"> Choice A rewrites the Cadillac paragraph around Leseur's sequence: the town stormed after battery night and day under Bureau, the castle composing the next day, the captain beheaded by Gaston IV for perjured homage; the sentence "whose captain the king had executed" corrected in the text, not silently in a note; the "three accounts set down as they stand" display demoted to a note with Courteault's "c'est une erreur" quoted there; the Castillon surrender corrected to three days; the false report rewritten to name two traditions, camp-followers and garrison, with the gap flag closed on that basis; the Breton charge stated in one sentence in the dissent paragraph beside Howard, DeVries and Hall; the Fronsac empty field entering section V in summary with one short quotation; Blaye's sack stated in section V with a clause noting the census is Normandy-scoped; and Leseur named in the text once, as the fullest narrative of the Gascon campaign and not as an authority. The Hâ-and-Trompette commission and the Foix muster go to chapter 7. This costs a rewritten paragraph, perhaps two hundred words across the chapter, and one small loss of rhetorical force, because "the king had executed" was doing the work of showing the crown's punitive reach and Gaston's execution of his own vassal does that work less directly. It buys a settled exception, a closed gap, and a dissent the chapter owns before a reviewer produces it.</w:t>
+      </w:r>
+    </w:p>
+    <w:p>
+      <w:pPr>
+        <w:spacing w:after="150" w:line="290"/>
+      </w:pPr>
+      <w:r>
+        <w:rPr>
+          <w:rFonts w:ascii="Georgia" w:cs="Georgia" w:eastAsia="Georgia" w:hAnsi="Georgia"/>
+          <w:sz w:val="22"/>
+          <w:szCs w:val="22"/>
+        </w:rPr>
+        <w:t xml:space="preserve">Choice B takes the corrections that cannot be avoided and holds the rest. The executioner, the three days and the false report are corrected; Leseur enters as a fourth voice inside the existing three-account display rather than replacing it; the Breton charge, Fronsac, Blaye and the naming of Leseur are deferred until the Escouchy re-check and the second-Cadillac question are settled. This is cheaper and keeps the chapter's present shape. The cost is that the display the chapter calls "three accounts set down as they stand" would now stand beside an editor's flat verdict that one of them is wrong, and the Breton charge would remain uncarried in a chapter whose intake says it must be carried.</w:t>
+      </w:r>
+    </w:p>
+    <w:p>
+      <w:pPr>
+        <w:spacing w:after="150" w:line="290"/>
+      </w:pPr>
+      <w:r>
+        <w:rPr>
+          <w:rFonts w:ascii="Georgia" w:cs="Georgia" w:eastAsia="Georgia" w:hAnsi="Georgia"/>
+          <w:b/>
+          <w:bCs/>
+          <w:sz w:val="22"/>
+          <w:szCs w:val="22"/>
+        </w:rPr>
+        <w:t xml:space="preserve">My view.</w:t>
+      </w:r>
+      <w:r>
+        <w:rPr>
+          <w:rFonts w:ascii="Georgia" w:cs="Georgia" w:eastAsia="Georgia" w:hAnsi="Georgia"/>
+          <w:sz w:val="22"/>
+          <w:szCs w:val="22"/>
+        </w:rPr>
+        <w:t xml:space="preserve"> Choice A, with one exception: keep Leseur out of the running text if you find naming a panegyrist beside Basin and Escouchy crowds the section, and let the note carry him. The Breton charge is the item I would not defer under any choice. This is a view.</w:t>
+      </w:r>
+    </w:p>
+    <w:p>
+      <w:pPr>
+        <w:pBdr>
+          <w:top w:val="single" w:color="C9A227" w:sz="6"/>
+          <w:left w:val="single" w:color="C9A227" w:sz="6"/>
+          <w:right w:val="single" w:color="C9A227" w:sz="6"/>
+        </w:pBdr>
+        <w:shd w:fill="FFF4D6" w:color="auto" w:val="clear"/>
+        <w:spacing w:after="60" w:before="200"/>
+      </w:pPr>
+      <w:r>
+        <w:rPr>
+          <w:rFonts w:ascii="Georgia" w:cs="Georgia" w:eastAsia="Georgia" w:hAnsi="Georgia"/>
+          <w:b/>
+          <w:bCs/>
+          <w:color w:val="8A6D00"/>
+          <w:sz w:val="23"/>
+          <w:szCs w:val="23"/>
+        </w:rPr>
+        <w:t xml:space="preserve">YOUR RULING:  </w:t>
+      </w:r>
+    </w:p>
+    <w:p>
+      <w:pPr>
+        <w:pBdr>
+          <w:left w:val="single" w:color="C9A227" w:sz="6"/>
+          <w:right w:val="single" w:color="C9A227" w:sz="6"/>
+        </w:pBdr>
+        <w:shd w:fill="FFF4D6" w:color="auto" w:val="clear"/>
+        <w:spacing w:after="40"/>
+      </w:pPr>
+      <w:r>
+        <w:rPr>
+          <w:sz w:val="22"/>
+          <w:szCs w:val="22"/>
+        </w:rPr>
+        <w:t xml:space="preserve"> </w:t>
+      </w:r>
+    </w:p>
+    <w:p>
+      <w:pPr>
+        <w:pBdr>
+          <w:left w:val="single" w:color="C9A227" w:sz="6"/>
+          <w:right w:val="single" w:color="C9A227" w:sz="6"/>
+        </w:pBdr>
+        <w:shd w:fill="FFF4D6" w:color="auto" w:val="clear"/>
+        <w:spacing w:after="40"/>
+      </w:pPr>
+      <w:r>
+        <w:rPr>
+          <w:sz w:val="22"/>
+          <w:szCs w:val="22"/>
+        </w:rPr>
+        <w:t xml:space="preserve"> </w:t>
+      </w:r>
+    </w:p>
+    <w:p>
+      <w:pPr>
+        <w:pBdr>
+          <w:bottom w:val="single" w:color="C9A227" w:sz="6"/>
+          <w:left w:val="single" w:color="C9A227" w:sz="6"/>
+          <w:right w:val="single" w:color="C9A227" w:sz="6"/>
+        </w:pBdr>
+        <w:shd w:fill="FFF4D6" w:color="auto" w:val="clear"/>
+        <w:spacing w:after="60"/>
+      </w:pPr>
+      <w:r>
+        <w:rPr>
+          <w:sz w:val="22"/>
+          <w:szCs w:val="22"/>
+        </w:rPr>
+        <w:t xml:space="preserve"> </w:t>
+      </w:r>
+    </w:p>
+    <w:p>
+      <w:pPr>
+        <w:pStyle w:val="Heading2"/>
+        <w:spacing w:after="120" w:before="260"/>
+      </w:pPr>
+      <w:r>
+        <w:rPr>
+          <w:rFonts w:ascii="Georgia" w:cs="Georgia" w:eastAsia="Georgia" w:hAnsi="Georgia"/>
+          <w:b/>
+          <w:bCs/>
+          <w:color w:val="1F3864"/>
+          <w:sz w:val="25"/>
+          <w:szCs w:val="25"/>
+        </w:rPr>
+        <w:t xml:space="preserve">Decision 30 — Belloc and the knock-out blow, as Holman has them</w:t>
+      </w:r>
+    </w:p>
+    <w:p>
+      <w:pPr>
+        <w:spacing w:after="140"/>
+      </w:pPr>
+      <w:r>
+        <w:rPr>
+          <w:rFonts w:ascii="Georgia" w:cs="Georgia" w:eastAsia="Georgia" w:hAnsi="Georgia"/>
+          <w:i/>
+          <w:iCs/>
+          <w:color w:val="777777"/>
+          <w:sz w:val="19"/>
+          <w:szCs w:val="19"/>
+        </w:rPr>
+        <w:t xml:space="preserve">Covers rows: H14-a, H14-b, H14-c, H14-d, H14-e, H14-f, H14-g; executes ruling (r) on Belloc</w:t>
+      </w:r>
+    </w:p>
+    <w:p>
+      <w:pPr>
+        <w:spacing w:after="150" w:line="290"/>
+      </w:pPr>
+      <w:r>
+        <w:rPr>
+          <w:rFonts w:ascii="Georgia" w:cs="Georgia" w:eastAsia="Georgia" w:hAnsi="Georgia"/>
+          <w:b/>
+          <w:bCs/>
+          <w:sz w:val="22"/>
+          <w:szCs w:val="22"/>
+        </w:rPr>
+        <w:t xml:space="preserve">The background.</w:t>
+      </w:r>
+      <w:r>
+        <w:rPr>
+          <w:rFonts w:ascii="Georgia" w:cs="Georgia" w:eastAsia="Georgia" w:hAnsi="Georgia"/>
+          <w:sz w:val="22"/>
+          <w:szCs w:val="22"/>
+        </w:rPr>
+        <w:t xml:space="preserve"> On 16 September you ruled YES on row (r): chapter 6 may cite Belloc's Maxim-gun couplet for the syndrome of faith in the weapon detached from the process that makes it decisive, with Freedman and Holman carrying the twentieth-century genealogy of the "knock-out blow", the interwar belief that a single aerial bombardment would end a war in days. That ruling assumed Holman would be read. He has been, and this decision executes it. Brett Holman's </w:t>
+      </w:r>
+      <w:r>
+        <w:rPr>
+          <w:rFonts w:ascii="Georgia" w:cs="Georgia" w:eastAsia="Georgia" w:hAnsi="Georgia"/>
+          <w:i/>
+          <w:iCs/>
+          <w:sz w:val="22"/>
+          <w:szCs w:val="22"/>
+        </w:rPr>
+        <w:t xml:space="preserve">The Next War in the Air: Britain's Fear of the Bomber, 1908–1941</w:t>
+      </w:r>
+      <w:r>
+        <w:rPr>
+          <w:rFonts w:ascii="Georgia" w:cs="Georgia" w:eastAsia="Georgia" w:hAnsi="Georgia"/>
+          <w:sz w:val="22"/>
+          <w:szCs w:val="22"/>
+        </w:rPr>
+        <w:t xml:space="preserve"> (Ashgate, 2014) is the book Lawrence Freedman cited when the chapter borrowed the genealogy from him at second hand.</w:t>
+      </w:r>
+    </w:p>
+    <w:p>
+      <w:pPr>
+        <w:spacing w:after="150" w:line="290"/>
+      </w:pPr>
+      <w:r>
+        <w:rPr>
+          <w:rFonts w:ascii="Georgia" w:cs="Georgia" w:eastAsia="Georgia" w:hAnsi="Georgia"/>
+          <w:sz w:val="22"/>
+          <w:szCs w:val="22"/>
+        </w:rPr>
+        <w:t xml:space="preserve">Chapter 6, section VI, closes Talbot's death with a mirror: he "attacked the weapon, when what was defeating England was the process", and "a later chapter meets the same mistake with its sign reversed, in the prophets of the knock-out blow, for whom the weapon was over- rather than under-estimated". In its renovated form the passage speaks of "the interwar orthodoxy that a single blow from the air would end a war" and cites Freedman for a genealogy he "traces through Holman (Freedman 2017: 55–57)". Holman's own sentence, at page 23, reads: "This theory of the knock-out blow solidified into a near-consensus among military intellectuals during the 1920s and by the 1930s had almost become an orthodoxy, accepted and promoted by pacifists and militarists alike." Freedman dropped the word "almost", and the chapter inherited the stronger form. Holman's scope is Britain, not the century: "The knock-out blow was practically paradigmatic in interwar Britain" (p. 252). He names the lineage, which the chapter presently leaves unnamed: first articulated by Claude Grahame-White and Harry Harper in 1916, popularised by P. R. C. Groves from 1922, canonised by Baldwin's "the bomber will always get through" in November 1932 (pp. 57, 247–48); and he warns that Douhet, whom a general reader expects at the head of the line, was little known in Britain before the mid-1930s (p. 12). His diagnosis of the prophets' error is not what the chapter implies: they feared the collapse of an interdependent industrial society more than the collapse of morale (p. 53), and what they never theorised was the defender's capacity to absorb, repair and re-house, so that the Blitz was, in his phrase, "best defeated with better bureaucracy" (p. 238). He also supplies the instrument creating the institution: the Gotha raids of 1917 produced the Smuts reports and, through them, the Air Ministry and the RAF (pp. 232–33).</w:t>
+      </w:r>
+    </w:p>
+    <w:p>
+      <w:pPr>
+        <w:spacing w:after="150" w:line="290"/>
+      </w:pPr>
+      <w:r>
+        <w:rPr>
+          <w:rFonts w:ascii="Georgia" w:cs="Georgia" w:eastAsia="Georgia" w:hAnsi="Georgia"/>
+          <w:sz w:val="22"/>
+          <w:szCs w:val="22"/>
+        </w:rPr>
+        <w:t xml:space="preserve">The negative finding is the one ruling (r) was waiting for. Belloc occurs nowhere in Holman, not in text, notes, bibliography or index. The two halves of the chapter's mirror, the 1898 couplet and the bomber prophets, cannot be joined at one source; the couplet is not part of the knock-out-blow lineage. That does not disturb the ruling, because the chapter already segregates the prophets as "a different lineage"; it means the segregation must be kept and the apparatus must say why.</w:t>
+      </w:r>
+    </w:p>
+    <w:p>
+      <w:pPr>
+        <w:spacing w:after="150" w:line="290"/>
+      </w:pPr>
+      <w:r>
+        <w:rPr>
+          <w:rFonts w:ascii="Georgia" w:cs="Georgia" w:eastAsia="Georgia" w:hAnsi="Georgia"/>
+          <w:b/>
+          <w:bCs/>
+          <w:sz w:val="22"/>
+          <w:szCs w:val="22"/>
+        </w:rPr>
+        <w:t xml:space="preserve">Why it matters.</w:t>
+      </w:r>
+      <w:r>
+        <w:rPr>
+          <w:rFonts w:ascii="Georgia" w:cs="Georgia" w:eastAsia="Georgia" w:hAnsi="Georgia"/>
+          <w:sz w:val="22"/>
+          <w:szCs w:val="22"/>
+        </w:rPr>
+        <w:t xml:space="preserve"> A small point in the argument and a real one in the manners. The mirror is a closing flourish, not a load-bearing claim, but a reviewer who knows Holman would see a hedge silently removed, a British finding stated as a century's, and Douhet implied where Holman's whole book argues against him. Citing at second hand what is now on the shelf would be noticed. The interdependence point cuts the other way and helps: it is the book's mechanism arriving from the defending side, and it is Holman's finding rather than the book's imposition.</w:t>
+      </w:r>
+    </w:p>
+    <w:p>
+      <w:pPr>
+        <w:spacing w:after="150" w:line="290"/>
+      </w:pPr>
+      <w:r>
+        <w:rPr>
+          <w:rFonts w:ascii="Georgia" w:cs="Georgia" w:eastAsia="Georgia" w:hAnsi="Georgia"/>
+          <w:b/>
+          <w:bCs/>
+          <w:sz w:val="22"/>
+          <w:szCs w:val="22"/>
+        </w:rPr>
+        <w:t xml:space="preserve">Your choices.</w:t>
+      </w:r>
+      <w:r>
+        <w:rPr>
+          <w:rFonts w:ascii="Georgia" w:cs="Georgia" w:eastAsia="Georgia" w:hAnsi="Georgia"/>
+          <w:sz w:val="22"/>
+          <w:szCs w:val="22"/>
+        </w:rPr>
+        <w:t xml:space="preserve"> Choice A cites Holman 2014: 23 directly and drops the Freedman relay, Freedman staying only for the Tokyo exchange of 1941; restores the hedge, so the sentence reads "had almost become an orthodoxy" or "a near-orthodoxy"; qualifies the phrase to interwar Britain in the text; names Grahame-White and Harper, Groves and Baldwin in the note with the Douhet caution beside them; adds one clause carrying Holman's diagnosis, interdependence over morale, at the cost of a longer sentence in a paragraph the voice ledger already counts as dense; reserves the Smuts-to-RAF pin and the 1940 administrative resolution for chapter 12, where the process point is at home; and states the negative finding on Belloc in the chapter's apparatus, in one sentence, so that a reader who checks finds the book checked first. Choice B does the same but keeps the genealogy's names and the Douhet caution out of the chapter entirely, in sources.md only, and leaves the Belloc finding there too. It costs less space and one fewer note; a reviewer would then find the negative finding in the working files and not on the page, which is defensible but not generous.</w:t>
+      </w:r>
+    </w:p>
+    <w:p>
+      <w:pPr>
+        <w:spacing w:after="150" w:line="290"/>
+      </w:pPr>
+      <w:r>
+        <w:rPr>
+          <w:rFonts w:ascii="Georgia" w:cs="Georgia" w:eastAsia="Georgia" w:hAnsi="Georgia"/>
+          <w:b/>
+          <w:bCs/>
+          <w:sz w:val="22"/>
+          <w:szCs w:val="22"/>
+        </w:rPr>
+        <w:t xml:space="preserve">My view.</w:t>
+      </w:r>
+      <w:r>
+        <w:rPr>
+          <w:rFonts w:ascii="Georgia" w:cs="Georgia" w:eastAsia="Georgia" w:hAnsi="Georgia"/>
+          <w:sz w:val="22"/>
+          <w:szCs w:val="22"/>
+        </w:rPr>
+        <w:t xml:space="preserve"> Choice A; the clause on interdependence is the only item that costs anything, and it is worth the length because it turns a decorative mirror into a second instance of the mechanism. This is a view.</w:t>
+      </w:r>
+    </w:p>
+    <w:p>
+      <w:pPr>
+        <w:pBdr>
+          <w:top w:val="single" w:color="C9A227" w:sz="6"/>
+          <w:left w:val="single" w:color="C9A227" w:sz="6"/>
+          <w:right w:val="single" w:color="C9A227" w:sz="6"/>
+        </w:pBdr>
+        <w:shd w:fill="FFF4D6" w:color="auto" w:val="clear"/>
+        <w:spacing w:after="60" w:before="200"/>
+      </w:pPr>
+      <w:r>
+        <w:rPr>
+          <w:rFonts w:ascii="Georgia" w:cs="Georgia" w:eastAsia="Georgia" w:hAnsi="Georgia"/>
+          <w:b/>
+          <w:bCs/>
+          <w:color w:val="8A6D00"/>
+          <w:sz w:val="23"/>
+          <w:szCs w:val="23"/>
+        </w:rPr>
+        <w:t xml:space="preserve">YOUR RULING:  </w:t>
+      </w:r>
+    </w:p>
+    <w:p>
+      <w:pPr>
+        <w:pBdr>
+          <w:left w:val="single" w:color="C9A227" w:sz="6"/>
+          <w:right w:val="single" w:color="C9A227" w:sz="6"/>
+        </w:pBdr>
+        <w:shd w:fill="FFF4D6" w:color="auto" w:val="clear"/>
+        <w:spacing w:after="40"/>
+      </w:pPr>
+      <w:r>
+        <w:rPr>
+          <w:sz w:val="22"/>
+          <w:szCs w:val="22"/>
+        </w:rPr>
+        <w:t xml:space="preserve"> </w:t>
+      </w:r>
+    </w:p>
+    <w:p>
+      <w:pPr>
+        <w:pBdr>
+          <w:left w:val="single" w:color="C9A227" w:sz="6"/>
+          <w:right w:val="single" w:color="C9A227" w:sz="6"/>
+        </w:pBdr>
+        <w:shd w:fill="FFF4D6" w:color="auto" w:val="clear"/>
+        <w:spacing w:after="40"/>
+      </w:pPr>
+      <w:r>
+        <w:rPr>
+          <w:sz w:val="22"/>
+          <w:szCs w:val="22"/>
+        </w:rPr>
+        <w:t xml:space="preserve"> </w:t>
+      </w:r>
+    </w:p>
+    <w:p>
+      <w:pPr>
+        <w:pBdr>
+          <w:bottom w:val="single" w:color="C9A227" w:sz="6"/>
+          <w:left w:val="single" w:color="C9A227" w:sz="6"/>
+          <w:right w:val="single" w:color="C9A227" w:sz="6"/>
+        </w:pBdr>
+        <w:shd w:fill="FFF4D6" w:color="auto" w:val="clear"/>
+        <w:spacing w:after="60"/>
+      </w:pPr>
+      <w:r>
+        <w:rPr>
+          <w:sz w:val="22"/>
+          <w:szCs w:val="22"/>
+        </w:rPr>
+        <w:t xml:space="preserve"> </w:t>
+      </w:r>
+    </w:p>
+    <w:p>
+      <w:pPr>
+        <w:pStyle w:val="Heading2"/>
+        <w:spacing w:after="120" w:before="260"/>
+      </w:pPr>
+      <w:r>
+        <w:rPr>
+          <w:rFonts w:ascii="Georgia" w:cs="Georgia" w:eastAsia="Georgia" w:hAnsi="Georgia"/>
+          <w:b/>
+          <w:bCs/>
+          <w:color w:val="1F3864"/>
+          <w:sz w:val="25"/>
+          <w:szCs w:val="25"/>
+        </w:rPr>
+        <w:t xml:space="preserve">Decision 31 — The Burgundian artillery accounts, as Perroy has them</w:t>
+      </w:r>
+    </w:p>
+    <w:p>
+      <w:pPr>
+        <w:spacing w:after="140"/>
+      </w:pPr>
+      <w:r>
+        <w:rPr>
+          <w:rFonts w:ascii="Georgia" w:cs="Georgia" w:eastAsia="Georgia" w:hAnsi="Georgia"/>
+          <w:i/>
+          <w:iCs/>
+          <w:color w:val="777777"/>
+          <w:sz w:val="19"/>
+          <w:szCs w:val="19"/>
+        </w:rPr>
+        <w:t xml:space="preserve">Covers rows: P43-a, P43-b, P43-c, P43-d, P43-e, P43-f, P43-g, P43-h</w:t>
+      </w:r>
+    </w:p>
+    <w:p>
+      <w:pPr>
+        <w:spacing w:after="150" w:line="290"/>
+      </w:pPr>
+      <w:r>
+        <w:rPr>
+          <w:rFonts w:ascii="Georgia" w:cs="Georgia" w:eastAsia="Georgia" w:hAnsi="Georgia"/>
+          <w:b/>
+          <w:bCs/>
+          <w:sz w:val="22"/>
+          <w:szCs w:val="22"/>
+        </w:rPr>
+        <w:t xml:space="preserve">The background.</w:t>
+      </w:r>
+      <w:r>
+        <w:rPr>
+          <w:rFonts w:ascii="Georgia" w:cs="Georgia" w:eastAsia="Georgia" w:hAnsi="Georgia"/>
+          <w:sz w:val="22"/>
+          <w:szCs w:val="22"/>
+        </w:rPr>
+        <w:t xml:space="preserve"> Édouard Perroy's two-part article, "L'artillerie de Louis XI dans la campagne d'Artois (1477)", in the </w:t>
+      </w:r>
+      <w:r>
+        <w:rPr>
+          <w:rFonts w:ascii="Georgia" w:cs="Georgia" w:eastAsia="Georgia" w:hAnsi="Georgia"/>
+          <w:i/>
+          <w:iCs/>
+          <w:sz w:val="22"/>
+          <w:szCs w:val="22"/>
+        </w:rPr>
+        <w:t xml:space="preserve">Revue du Nord</w:t>
+      </w:r>
+      <w:r>
+        <w:rPr>
+          <w:rFonts w:ascii="Georgia" w:cs="Georgia" w:eastAsia="Georgia" w:hAnsi="Georgia"/>
+          <w:sz w:val="22"/>
+          <w:szCs w:val="22"/>
+        </w:rPr>
+        <w:t xml:space="preserve"> for 1943, edits the only surviving accounts of the French royal artillery office, found by Robert Fawtier in a binding at the John Rylands Library. It was in the repository, cited twice in chapter 10 and entered nowhere. Chapter 10, section IV, currently says the accounts were recovered "from the binding of a 1721 book", and that the train's guns and tools "required 521 horses" while the stores "required 1,009 more". Perroy, checked on the page image because the text layer misreads digits, says 1,609, and gives the total the draft omits: "ce qui portait le convoi au total de 2.130 chevaux" (p. 294), at a forecast cost of 355 livres a day for the horses and 14,010 livres a month for the whole establishment (p. 302). The chapter has been six hundred horses short. The 1721 date is not in Perroy, who dates the binding to nothing; it must be cut or sourced elsewhere.</w:t>
+      </w:r>
+    </w:p>
+    <w:p>
+      <w:pPr>
+        <w:spacing w:after="150" w:line="290"/>
+      </w:pPr>
+      <w:r>
+        <w:rPr>
+          <w:rFonts w:ascii="Georgia" w:cs="Georgia" w:eastAsia="Georgia" w:hAnsi="Georgia"/>
+          <w:sz w:val="22"/>
+          <w:szCs w:val="22"/>
+        </w:rPr>
+        <w:t xml:space="preserve">He adds the wage line, "les vingt-deux autres … se contentent de 60 l. annuelles, ce qui représente les gages d'un modeste ouvrier, maçon ou charron" (pp. 191–92), twenty-two gunners paid as a mason or wheelwright; the audit that withheld Bureau's discharge for 28,704 livres owing (p. 177 n. 24); and a chronology the book should adopt rather than argue with: the organised artillery service belongs to Bournel and Louis XI, and of one under Charles VII "il ne reste aucune trace" (p. 175). For section VI he supplies the </w:t>
+      </w:r>
+      <w:r>
+        <w:rPr>
+          <w:rFonts w:ascii="Georgia" w:cs="Georgia" w:eastAsia="Georgia" w:hAnsi="Georgia"/>
+          <w:i/>
+          <w:iCs/>
+          <w:sz w:val="22"/>
+          <w:szCs w:val="22"/>
+        </w:rPr>
+        <w:t xml:space="preserve">bande de Bourgogne</w:t>
+      </w:r>
+      <w:r>
+        <w:rPr>
+          <w:rFonts w:ascii="Georgia" w:cs="Georgia" w:eastAsia="Georgia" w:hAnsi="Georgia"/>
+          <w:sz w:val="22"/>
+          <w:szCs w:val="22"/>
+        </w:rPr>
+        <w:t xml:space="preserve">, a fourth unit Louis XI raised for the conquest of the duchy and paid through the ducal accounts in the Côte-d'Or archives (p. 196), so that part of the Burgundian office passed to the king and not only to Mary and Maximilian; and, as anti-determinist ballast beside Grandson and Morat, the seven great culverins lost at Dole and the failure before Saint-Omer (pp. 173 n. 10, 299). Cazelles's review of Contamine reminds the chapter that the 1445 ordinance rests, like 1439, on a lost text.</w:t>
+      </w:r>
+    </w:p>
+    <w:p>
+      <w:pPr>
+        <w:spacing w:after="150" w:line="290"/>
+      </w:pPr>
+      <w:r>
+        <w:rPr>
+          <w:rFonts w:ascii="Georgia" w:cs="Georgia" w:eastAsia="Georgia" w:hAnsi="Georgia"/>
+          <w:sz w:val="22"/>
+          <w:szCs w:val="22"/>
+        </w:rPr>
+        <w:t xml:space="preserve">P43-h is different in kind. The intake found that chapter 10's sources file had carried since July a Cazelles sentence that is not in his review; it came from the "short quotation bank" in the acquisition dossier, a list of quotable lines compiled before the works were in hand. All eight lines were opened at the page. Six verified; two were withdrawn, both reviewers' verdicts paraphrased into quotation marks. Neither carried an argument.</w:t>
+      </w:r>
+    </w:p>
+    <w:p>
+      <w:pPr>
+        <w:spacing w:after="150" w:line="290"/>
+      </w:pPr>
+      <w:r>
+        <w:rPr>
+          <w:rFonts w:ascii="Georgia" w:cs="Georgia" w:eastAsia="Georgia" w:hAnsi="Georgia"/>
+          <w:b/>
+          <w:bCs/>
+          <w:sz w:val="22"/>
+          <w:szCs w:val="22"/>
+        </w:rPr>
+        <w:t xml:space="preserve">Why it matters.</w:t>
+      </w:r>
+      <w:r>
+        <w:rPr>
+          <w:rFonts w:ascii="Georgia" w:cs="Georgia" w:eastAsia="Georgia" w:hAnsi="Georgia"/>
+          <w:sz w:val="22"/>
+          <w:szCs w:val="22"/>
+        </w:rPr>
+        <w:t xml:space="preserve"> Housekeeping, except for the last item. A wrong horse count and an unsourced date are what a specialist uses to discount the chapter's whole fiscal register. P43-h is a discipline decision: the doctrine says no quotation without a page, and the bank is not a source.</w:t>
+      </w:r>
+    </w:p>
+    <w:p>
+      <w:pPr>
+        <w:spacing w:after="150" w:line="290"/>
+      </w:pPr>
+      <w:r>
+        <w:rPr>
+          <w:rFonts w:ascii="Georgia" w:cs="Georgia" w:eastAsia="Georgia" w:hAnsi="Georgia"/>
+          <w:b/>
+          <w:bCs/>
+          <w:sz w:val="22"/>
+          <w:szCs w:val="22"/>
+        </w:rPr>
+        <w:t xml:space="preserve">Your choices.</w:t>
+      </w:r>
+      <w:r>
+        <w:rPr>
+          <w:rFonts w:ascii="Georgia" w:cs="Georgia" w:eastAsia="Georgia" w:hAnsi="Georgia"/>
+          <w:sz w:val="22"/>
+          <w:szCs w:val="22"/>
+        </w:rPr>
+        <w:t xml:space="preserve"> Choice A takes all of P43-a to g: the 2,130 total with the monthly cost, the 1721 cut, the wage line and the audit each as one sentence, Perroy's chronology adopted and chapter 6 amended to match, the </w:t>
+      </w:r>
+      <w:r>
+        <w:rPr>
+          <w:rFonts w:ascii="Georgia" w:cs="Georgia" w:eastAsia="Georgia" w:hAnsi="Georgia"/>
+          <w:i/>
+          <w:iCs/>
+          <w:sz w:val="22"/>
+          <w:szCs w:val="22"/>
+        </w:rPr>
+        <w:t xml:space="preserve">bande de Bourgogne</w:t>
+      </w:r>
+      <w:r>
+        <w:rPr>
+          <w:rFonts w:ascii="Georgia" w:cs="Georgia" w:eastAsia="Georgia" w:hAnsi="Georgia"/>
+          <w:sz w:val="22"/>
+          <w:szCs w:val="22"/>
+        </w:rPr>
+        <w:t xml:space="preserve">, Dole and Saint-Omer at footnote length, and the 1445 caution stated. Choice B takes the corrections only and leaves the additions for the post-retrieval upgrade pass. Either way, P43-h is put to you separately as a rule: every quotation still standing in the manuscript from a source not in the corpus is re-verified at the page before press, or the bank is retired as a source.</w:t>
+      </w:r>
+    </w:p>
+    <w:p>
+      <w:pPr>
+        <w:spacing w:after="150" w:line="290"/>
+      </w:pPr>
+      <w:r>
+        <w:rPr>
+          <w:rFonts w:ascii="Georgia" w:cs="Georgia" w:eastAsia="Georgia" w:hAnsi="Georgia"/>
+          <w:b/>
+          <w:bCs/>
+          <w:sz w:val="22"/>
+          <w:szCs w:val="22"/>
+        </w:rPr>
+        <w:t xml:space="preserve">My view.</w:t>
+      </w:r>
+      <w:r>
+        <w:rPr>
+          <w:rFonts w:ascii="Georgia" w:cs="Georgia" w:eastAsia="Georgia" w:hAnsi="Georgia"/>
+          <w:sz w:val="22"/>
+          <w:szCs w:val="22"/>
+        </w:rPr>
+        <w:t xml:space="preserve"> Choice A, and the P43-h rule adopted as written; the two failures had the same shape and the third will too. This is a view.</w:t>
+      </w:r>
+    </w:p>
+    <w:p>
+      <w:pPr>
+        <w:pBdr>
+          <w:top w:val="single" w:color="C9A227" w:sz="6"/>
+          <w:left w:val="single" w:color="C9A227" w:sz="6"/>
+          <w:right w:val="single" w:color="C9A227" w:sz="6"/>
+        </w:pBdr>
+        <w:shd w:fill="FFF4D6" w:color="auto" w:val="clear"/>
+        <w:spacing w:after="60" w:before="200"/>
+      </w:pPr>
+      <w:r>
+        <w:rPr>
+          <w:rFonts w:ascii="Georgia" w:cs="Georgia" w:eastAsia="Georgia" w:hAnsi="Georgia"/>
+          <w:b/>
+          <w:bCs/>
+          <w:color w:val="8A6D00"/>
+          <w:sz w:val="23"/>
+          <w:szCs w:val="23"/>
+        </w:rPr>
+        <w:t xml:space="preserve">YOUR RULING:  </w:t>
+      </w:r>
+    </w:p>
+    <w:p>
+      <w:pPr>
+        <w:pBdr>
+          <w:left w:val="single" w:color="C9A227" w:sz="6"/>
+          <w:right w:val="single" w:color="C9A227" w:sz="6"/>
+        </w:pBdr>
+        <w:shd w:fill="FFF4D6" w:color="auto" w:val="clear"/>
+        <w:spacing w:after="40"/>
+      </w:pPr>
+      <w:r>
+        <w:rPr>
+          <w:sz w:val="22"/>
+          <w:szCs w:val="22"/>
+        </w:rPr>
+        <w:t xml:space="preserve"> </w:t>
+      </w:r>
+    </w:p>
+    <w:p>
+      <w:pPr>
+        <w:pBdr>
+          <w:left w:val="single" w:color="C9A227" w:sz="6"/>
+          <w:right w:val="single" w:color="C9A227" w:sz="6"/>
+        </w:pBdr>
+        <w:shd w:fill="FFF4D6" w:color="auto" w:val="clear"/>
+        <w:spacing w:after="40"/>
+      </w:pPr>
+      <w:r>
+        <w:rPr>
+          <w:sz w:val="22"/>
+          <w:szCs w:val="22"/>
+        </w:rPr>
+        <w:t xml:space="preserve"> </w:t>
+      </w:r>
+    </w:p>
+    <w:p>
+      <w:pPr>
+        <w:pBdr>
+          <w:bottom w:val="single" w:color="C9A227" w:sz="6"/>
+          <w:left w:val="single" w:color="C9A227" w:sz="6"/>
+          <w:right w:val="single" w:color="C9A227" w:sz="6"/>
+        </w:pBdr>
+        <w:shd w:fill="FFF4D6" w:color="auto" w:val="clear"/>
+        <w:spacing w:after="60"/>
+      </w:pPr>
+      <w:r>
+        <w:rPr>
+          <w:sz w:val="22"/>
+          <w:szCs w:val="22"/>
+        </w:rPr>
+        <w:t xml:space="preserve"> </w:t>
+      </w:r>
+    </w:p>
+    <w:p>
+      <w:pPr>
+        <w:pStyle w:val="Heading2"/>
+        <w:spacing w:after="120" w:before="260"/>
+      </w:pPr>
+      <w:r>
+        <w:rPr>
+          <w:rFonts w:ascii="Georgia" w:cs="Georgia" w:eastAsia="Georgia" w:hAnsi="Georgia"/>
+          <w:b/>
+          <w:bCs/>
+          <w:color w:val="1F3864"/>
+          <w:sz w:val="25"/>
+          <w:szCs w:val="25"/>
+        </w:rPr>
+        <w:t xml:space="preserve">Decision 32 — Two small additions from Tilly's 1975 volume</w:t>
+      </w:r>
+    </w:p>
+    <w:p>
+      <w:pPr>
+        <w:spacing w:after="140"/>
+      </w:pPr>
+      <w:r>
+        <w:rPr>
+          <w:rFonts w:ascii="Georgia" w:cs="Georgia" w:eastAsia="Georgia" w:hAnsi="Georgia"/>
+          <w:i/>
+          <w:iCs/>
+          <w:color w:val="777777"/>
+          <w:sz w:val="19"/>
+          <w:szCs w:val="19"/>
+        </w:rPr>
+        <w:t xml:space="preserve">Covers rows: 3-f, T75-c; T75-a, T75-b and T75-d are carried at Decision 10 and are not repeated here</w:t>
+      </w:r>
+    </w:p>
+    <w:p>
+      <w:pPr>
+        <w:spacing w:after="150" w:line="290"/>
+      </w:pPr>
+      <w:r>
+        <w:rPr>
+          <w:rFonts w:ascii="Georgia" w:cs="Georgia" w:eastAsia="Georgia" w:hAnsi="Georgia"/>
+          <w:b/>
+          <w:bCs/>
+          <w:sz w:val="22"/>
+          <w:szCs w:val="22"/>
+        </w:rPr>
+        <w:t xml:space="preserve">The background.</w:t>
+      </w:r>
+      <w:r>
+        <w:rPr>
+          <w:rFonts w:ascii="Georgia" w:cs="Georgia" w:eastAsia="Georgia" w:hAnsi="Georgia"/>
+          <w:sz w:val="22"/>
+          <w:szCs w:val="22"/>
+        </w:rPr>
+        <w:t xml:space="preserve"> Charles Tilly's edited volume </w:t>
+      </w:r>
+      <w:r>
+        <w:rPr>
+          <w:rFonts w:ascii="Georgia" w:cs="Georgia" w:eastAsia="Georgia" w:hAnsi="Georgia"/>
+          <w:i/>
+          <w:iCs/>
+          <w:sz w:val="22"/>
+          <w:szCs w:val="22"/>
+        </w:rPr>
+        <w:t xml:space="preserve">The Formation of National States in Western Europe</w:t>
+      </w:r>
+      <w:r>
+        <w:rPr>
+          <w:rFonts w:ascii="Georgia" w:cs="Georgia" w:eastAsia="Georgia" w:hAnsi="Georgia"/>
+          <w:sz w:val="22"/>
+          <w:szCs w:val="22"/>
+        </w:rPr>
+        <w:t xml:space="preserve"> (Princeton, 1975) was read in full in September. Its main consequences for chapter 10, the concession to Samuel Finer's chapter two, the three-verb formula "abridging, destroying or absorbing", and Tilly's warning against inferring modern sequences from European ones, are handled at Decision 10. Two items remain.</w:t>
+      </w:r>
+    </w:p>
+    <w:p>
+      <w:pPr>
+        <w:spacing w:after="150" w:line="290"/>
+      </w:pPr>
+      <w:r>
+        <w:rPr>
+          <w:rFonts w:ascii="Georgia" w:cs="Georgia" w:eastAsia="Georgia" w:hAnsi="Georgia"/>
+          <w:sz w:val="22"/>
+          <w:szCs w:val="22"/>
+        </w:rPr>
+        <w:t xml:space="preserve">The first is chapter 3. Section I states the chapter's thesis as "a composite, and this book marks it as its own synthesis rather than anyone's consensus", assembled from Tilly, Kaminsky and McFarlane. Finer's chapter offers a named frame for the same question: a ruler choosing a military format weighs three considerations, "the effectiveness of the force", "its expense", and "would it be loyal to the ruler?" (pp. 91, 95). Restating the composite on those three lets the synthesis stand visibly as an extension of a named work rather than an unattributed assembly, and the same sentence would take the correction to its conditional clause proposed under item 3-a, whose text I do not have and cannot quote.</w:t>
+      </w:r>
+    </w:p>
+    <w:p>
+      <w:pPr>
+        <w:spacing w:after="150" w:line="290"/>
+      </w:pPr>
+      <w:r>
+        <w:rPr>
+          <w:rFonts w:ascii="Georgia" w:cs="Georgia" w:eastAsia="Georgia" w:hAnsi="Georgia"/>
+          <w:sz w:val="22"/>
+          <w:szCs w:val="22"/>
+        </w:rPr>
+        <w:t xml:space="preserve">The second is chapter 10, section VI, the counter-cases. Finer supplies Brandenburg-Prussia, where the Great Elector's excise of 1680 was "indefinitely expansible" and "led to the euthanasia of the Estates" (p. 138): a polity where the tax made the assembly redundant with no artillery in the story at all, the fisc without the gun. Decision 24 already offers Matthias Corvinus as a fifth counter-case, so Brandenburg would be a sixth.</w:t>
+      </w:r>
+    </w:p>
+    <w:p>
+      <w:pPr>
+        <w:spacing w:after="150" w:line="290"/>
+      </w:pPr>
+      <w:r>
+        <w:rPr>
+          <w:rFonts w:ascii="Georgia" w:cs="Georgia" w:eastAsia="Georgia" w:hAnsi="Georgia"/>
+          <w:b/>
+          <w:bCs/>
+          <w:sz w:val="22"/>
+          <w:szCs w:val="22"/>
+        </w:rPr>
+        <w:t xml:space="preserve">Why it matters.</w:t>
+      </w:r>
+      <w:r>
+        <w:rPr>
+          <w:rFonts w:ascii="Georgia" w:cs="Georgia" w:eastAsia="Georgia" w:hAnsi="Georgia"/>
+          <w:sz w:val="22"/>
+          <w:szCs w:val="22"/>
+        </w:rPr>
+        <w:t xml:space="preserve"> Small. Both are questions of manners: whether a synthesis names the frame it extends, and whether the comparative register carries the one case that isolates the fiscal limb from the military one. A reviewer who knows Finer would notice the first; the second strengthens the book's own discipline.</w:t>
+      </w:r>
+    </w:p>
+    <w:p>
+      <w:pPr>
+        <w:spacing w:after="150" w:line="290"/>
+      </w:pPr>
+      <w:r>
+        <w:rPr>
+          <w:rFonts w:ascii="Georgia" w:cs="Georgia" w:eastAsia="Georgia" w:hAnsi="Georgia"/>
+          <w:b/>
+          <w:bCs/>
+          <w:sz w:val="22"/>
+          <w:szCs w:val="22"/>
+        </w:rPr>
+        <w:t xml:space="preserve">Your choices.</w:t>
+      </w:r>
+      <w:r>
+        <w:rPr>
+          <w:rFonts w:ascii="Georgia" w:cs="Georgia" w:eastAsia="Georgia" w:hAnsi="Georgia"/>
+          <w:sz w:val="22"/>
+          <w:szCs w:val="22"/>
+        </w:rPr>
+        <w:t xml:space="preserve"> Choice A takes both: the composite restated on effectiveness, expense and loyalty, and Brandenburg added at footnote length. Choice B takes the chapter 3 restatement and declines Brandenburg, leaving section VI at its present number, on the ground that a case without guns tests the fisc and not the mechanism.</w:t>
+      </w:r>
+    </w:p>
+    <w:p>
+      <w:pPr>
+        <w:spacing w:after="150" w:line="290"/>
+      </w:pPr>
+      <w:r>
+        <w:rPr>
+          <w:rFonts w:ascii="Georgia" w:cs="Georgia" w:eastAsia="Georgia" w:hAnsi="Georgia"/>
+          <w:b/>
+          <w:bCs/>
+          <w:sz w:val="22"/>
+          <w:szCs w:val="22"/>
+        </w:rPr>
+        <w:t xml:space="preserve">My view.</w:t>
+      </w:r>
+      <w:r>
+        <w:rPr>
+          <w:rFonts w:ascii="Georgia" w:cs="Georgia" w:eastAsia="Georgia" w:hAnsi="Georgia"/>
+          <w:sz w:val="22"/>
+          <w:szCs w:val="22"/>
+        </w:rPr>
+        <w:t xml:space="preserve"> Choice A; the Brandenburg footnote is the cheapest honest test the section can carry. This is a view.</w:t>
+      </w:r>
+    </w:p>
+    <w:p>
+      <w:pPr>
+        <w:pBdr>
+          <w:top w:val="single" w:color="C9A227" w:sz="6"/>
+          <w:left w:val="single" w:color="C9A227" w:sz="6"/>
+          <w:right w:val="single" w:color="C9A227" w:sz="6"/>
+        </w:pBdr>
+        <w:shd w:fill="FFF4D6" w:color="auto" w:val="clear"/>
+        <w:spacing w:after="60" w:before="200"/>
+      </w:pPr>
+      <w:r>
+        <w:rPr>
+          <w:rFonts w:ascii="Georgia" w:cs="Georgia" w:eastAsia="Georgia" w:hAnsi="Georgia"/>
+          <w:b/>
+          <w:bCs/>
+          <w:color w:val="8A6D00"/>
+          <w:sz w:val="23"/>
+          <w:szCs w:val="23"/>
+        </w:rPr>
+        <w:t xml:space="preserve">YOUR RULING:  </w:t>
+      </w:r>
+    </w:p>
+    <w:p>
+      <w:pPr>
+        <w:pBdr>
+          <w:left w:val="single" w:color="C9A227" w:sz="6"/>
+          <w:right w:val="single" w:color="C9A227" w:sz="6"/>
+        </w:pBdr>
+        <w:shd w:fill="FFF4D6" w:color="auto" w:val="clear"/>
+        <w:spacing w:after="40"/>
+      </w:pPr>
+      <w:r>
+        <w:rPr>
+          <w:sz w:val="22"/>
+          <w:szCs w:val="22"/>
+        </w:rPr>
+        <w:t xml:space="preserve"> </w:t>
+      </w:r>
+    </w:p>
+    <w:p>
+      <w:pPr>
+        <w:pBdr>
+          <w:left w:val="single" w:color="C9A227" w:sz="6"/>
+          <w:right w:val="single" w:color="C9A227" w:sz="6"/>
+        </w:pBdr>
+        <w:shd w:fill="FFF4D6" w:color="auto" w:val="clear"/>
+        <w:spacing w:after="40"/>
+      </w:pPr>
+      <w:r>
+        <w:rPr>
+          <w:sz w:val="22"/>
+          <w:szCs w:val="22"/>
+        </w:rPr>
+        <w:t xml:space="preserve"> </w:t>
+      </w:r>
+    </w:p>
+    <w:p>
+      <w:pPr>
+        <w:pBdr>
+          <w:bottom w:val="single" w:color="C9A227" w:sz="6"/>
+          <w:left w:val="single" w:color="C9A227" w:sz="6"/>
+          <w:right w:val="single" w:color="C9A227" w:sz="6"/>
+        </w:pBdr>
+        <w:shd w:fill="FFF4D6" w:color="auto" w:val="clear"/>
+        <w:spacing w:after="60"/>
+      </w:pPr>
+      <w:r>
+        <w:rPr>
+          <w:sz w:val="22"/>
+          <w:szCs w:val="22"/>
+        </w:rPr>
+        <w:t xml:space="preserve"> </w:t>
       </w:r>
     </w:p>
     <w:p>
@@ -8796,7 +10030,7 @@
                 <w:sz w:val="19"/>
                 <w:szCs w:val="19"/>
               </w:rPr>
-              <w:t xml:space="preserve">What "the ratchet" is: artillery only, or capital-intensity in general</w:t>
+              <w:t xml:space="preserve">What "the ratchet" is, and whose thesis it is: artillery only, or capital-intensity in general; Finer, Bean and Tilly as predecessors</w:t>
             </w:r>
           </w:p>
         </w:tc>
@@ -8928,7 +10162,7 @@
                 <w:sz w:val="19"/>
                 <w:szCs w:val="19"/>
               </w:rPr>
-              <w:t xml:space="preserve">Taxes, not credit: what kind of settlement 1439–46 was</w:t>
+              <w:t xml:space="preserve">Taxes, not credit: what kind of settlement 1439–51 was, and when the Estates General met</w:t>
             </w:r>
           </w:p>
         </w:tc>
@@ -10011,6 +11245,270 @@
           </w:p>
         </w:tc>
       </w:tr>
+      <w:tr>
+        <w:tc>
+          <w:tcPr>
+            <w:tcW w:type="dxa" w:w="900"/>
+            <w:tcMar>
+              <w:top w:type="dxa" w:w="80"/>
+              <w:left w:type="dxa" w:w="100"/>
+              <w:bottom w:type="dxa" w:w="80"/>
+              <w:right w:type="dxa" w:w="100"/>
+            </w:tcMar>
+          </w:tcPr>
+          <w:p>
+            <w:r>
+              <w:rPr>
+                <w:rFonts w:ascii="Georgia" w:cs="Georgia" w:eastAsia="Georgia" w:hAnsi="Georgia"/>
+                <w:sz w:val="19"/>
+                <w:szCs w:val="19"/>
+              </w:rPr>
+              <w:t xml:space="preserve">29</w:t>
+            </w:r>
+          </w:p>
+        </w:tc>
+        <w:tc>
+          <w:tcPr>
+            <w:tcW w:type="dxa" w:w="5300"/>
+            <w:tcMar>
+              <w:top w:type="dxa" w:w="80"/>
+              <w:left w:type="dxa" w:w="100"/>
+              <w:bottom w:type="dxa" w:w="80"/>
+              <w:right w:type="dxa" w:w="100"/>
+            </w:tcMar>
+          </w:tcPr>
+          <w:p>
+            <w:r>
+              <w:rPr>
+                <w:rFonts w:ascii="Georgia" w:cs="Georgia" w:eastAsia="Georgia" w:hAnsi="Georgia"/>
+                <w:sz w:val="19"/>
+                <w:szCs w:val="19"/>
+              </w:rPr>
+              <w:t xml:space="preserve">Cadillac and Castillon, as Leseur has them</w:t>
+            </w:r>
+          </w:p>
+        </w:tc>
+        <w:tc>
+          <w:tcPr>
+            <w:tcW w:type="dxa" w:w="3000"/>
+            <w:shd w:fill="FFF4D6" w:color="auto" w:val="clear"/>
+            <w:tcMar>
+              <w:top w:type="dxa" w:w="80"/>
+              <w:left w:type="dxa" w:w="100"/>
+              <w:bottom w:type="dxa" w:w="80"/>
+              <w:right w:type="dxa" w:w="100"/>
+            </w:tcMar>
+          </w:tcPr>
+          <w:p>
+            <w:r>
+              <w:rPr>
+                <w:rFonts w:ascii="Georgia" w:cs="Georgia" w:eastAsia="Georgia" w:hAnsi="Georgia"/>
+                <w:sz w:val="19"/>
+                <w:szCs w:val="19"/>
+              </w:rPr>
+              <w:t xml:space="preserve"/>
+            </w:r>
+          </w:p>
+        </w:tc>
+      </w:tr>
+      <w:tr>
+        <w:tc>
+          <w:tcPr>
+            <w:tcW w:type="dxa" w:w="900"/>
+            <w:tcMar>
+              <w:top w:type="dxa" w:w="80"/>
+              <w:left w:type="dxa" w:w="100"/>
+              <w:bottom w:type="dxa" w:w="80"/>
+              <w:right w:type="dxa" w:w="100"/>
+            </w:tcMar>
+          </w:tcPr>
+          <w:p>
+            <w:r>
+              <w:rPr>
+                <w:rFonts w:ascii="Georgia" w:cs="Georgia" w:eastAsia="Georgia" w:hAnsi="Georgia"/>
+                <w:sz w:val="19"/>
+                <w:szCs w:val="19"/>
+              </w:rPr>
+              <w:t xml:space="preserve">30</w:t>
+            </w:r>
+          </w:p>
+        </w:tc>
+        <w:tc>
+          <w:tcPr>
+            <w:tcW w:type="dxa" w:w="5300"/>
+            <w:tcMar>
+              <w:top w:type="dxa" w:w="80"/>
+              <w:left w:type="dxa" w:w="100"/>
+              <w:bottom w:type="dxa" w:w="80"/>
+              <w:right w:type="dxa" w:w="100"/>
+            </w:tcMar>
+          </w:tcPr>
+          <w:p>
+            <w:r>
+              <w:rPr>
+                <w:rFonts w:ascii="Georgia" w:cs="Georgia" w:eastAsia="Georgia" w:hAnsi="Georgia"/>
+                <w:sz w:val="19"/>
+                <w:szCs w:val="19"/>
+              </w:rPr>
+              <w:t xml:space="preserve">Belloc and the knock-out blow, as Holman has them</w:t>
+            </w:r>
+          </w:p>
+        </w:tc>
+        <w:tc>
+          <w:tcPr>
+            <w:tcW w:type="dxa" w:w="3000"/>
+            <w:shd w:fill="FFF4D6" w:color="auto" w:val="clear"/>
+            <w:tcMar>
+              <w:top w:type="dxa" w:w="80"/>
+              <w:left w:type="dxa" w:w="100"/>
+              <w:bottom w:type="dxa" w:w="80"/>
+              <w:right w:type="dxa" w:w="100"/>
+            </w:tcMar>
+          </w:tcPr>
+          <w:p>
+            <w:r>
+              <w:rPr>
+                <w:rFonts w:ascii="Georgia" w:cs="Georgia" w:eastAsia="Georgia" w:hAnsi="Georgia"/>
+                <w:sz w:val="19"/>
+                <w:szCs w:val="19"/>
+              </w:rPr>
+              <w:t xml:space="preserve"/>
+            </w:r>
+          </w:p>
+        </w:tc>
+      </w:tr>
+      <w:tr>
+        <w:tc>
+          <w:tcPr>
+            <w:tcW w:type="dxa" w:w="900"/>
+            <w:tcMar>
+              <w:top w:type="dxa" w:w="80"/>
+              <w:left w:type="dxa" w:w="100"/>
+              <w:bottom w:type="dxa" w:w="80"/>
+              <w:right w:type="dxa" w:w="100"/>
+            </w:tcMar>
+          </w:tcPr>
+          <w:p>
+            <w:r>
+              <w:rPr>
+                <w:rFonts w:ascii="Georgia" w:cs="Georgia" w:eastAsia="Georgia" w:hAnsi="Georgia"/>
+                <w:sz w:val="19"/>
+                <w:szCs w:val="19"/>
+              </w:rPr>
+              <w:t xml:space="preserve">31</w:t>
+            </w:r>
+          </w:p>
+        </w:tc>
+        <w:tc>
+          <w:tcPr>
+            <w:tcW w:type="dxa" w:w="5300"/>
+            <w:tcMar>
+              <w:top w:type="dxa" w:w="80"/>
+              <w:left w:type="dxa" w:w="100"/>
+              <w:bottom w:type="dxa" w:w="80"/>
+              <w:right w:type="dxa" w:w="100"/>
+            </w:tcMar>
+          </w:tcPr>
+          <w:p>
+            <w:r>
+              <w:rPr>
+                <w:rFonts w:ascii="Georgia" w:cs="Georgia" w:eastAsia="Georgia" w:hAnsi="Georgia"/>
+                <w:sz w:val="19"/>
+                <w:szCs w:val="19"/>
+              </w:rPr>
+              <w:t xml:space="preserve">The Burgundian artillery accounts, as Perroy has them</w:t>
+            </w:r>
+          </w:p>
+        </w:tc>
+        <w:tc>
+          <w:tcPr>
+            <w:tcW w:type="dxa" w:w="3000"/>
+            <w:shd w:fill="FFF4D6" w:color="auto" w:val="clear"/>
+            <w:tcMar>
+              <w:top w:type="dxa" w:w="80"/>
+              <w:left w:type="dxa" w:w="100"/>
+              <w:bottom w:type="dxa" w:w="80"/>
+              <w:right w:type="dxa" w:w="100"/>
+            </w:tcMar>
+          </w:tcPr>
+          <w:p>
+            <w:r>
+              <w:rPr>
+                <w:rFonts w:ascii="Georgia" w:cs="Georgia" w:eastAsia="Georgia" w:hAnsi="Georgia"/>
+                <w:sz w:val="19"/>
+                <w:szCs w:val="19"/>
+              </w:rPr>
+              <w:t xml:space="preserve"/>
+            </w:r>
+          </w:p>
+        </w:tc>
+      </w:tr>
+      <w:tr>
+        <w:tc>
+          <w:tcPr>
+            <w:tcW w:type="dxa" w:w="900"/>
+            <w:tcMar>
+              <w:top w:type="dxa" w:w="80"/>
+              <w:left w:type="dxa" w:w="100"/>
+              <w:bottom w:type="dxa" w:w="80"/>
+              <w:right w:type="dxa" w:w="100"/>
+            </w:tcMar>
+          </w:tcPr>
+          <w:p>
+            <w:r>
+              <w:rPr>
+                <w:rFonts w:ascii="Georgia" w:cs="Georgia" w:eastAsia="Georgia" w:hAnsi="Georgia"/>
+                <w:sz w:val="19"/>
+                <w:szCs w:val="19"/>
+              </w:rPr>
+              <w:t xml:space="preserve">32</w:t>
+            </w:r>
+          </w:p>
+        </w:tc>
+        <w:tc>
+          <w:tcPr>
+            <w:tcW w:type="dxa" w:w="5300"/>
+            <w:tcMar>
+              <w:top w:type="dxa" w:w="80"/>
+              <w:left w:type="dxa" w:w="100"/>
+              <w:bottom w:type="dxa" w:w="80"/>
+              <w:right w:type="dxa" w:w="100"/>
+            </w:tcMar>
+          </w:tcPr>
+          <w:p>
+            <w:r>
+              <w:rPr>
+                <w:rFonts w:ascii="Georgia" w:cs="Georgia" w:eastAsia="Georgia" w:hAnsi="Georgia"/>
+                <w:sz w:val="19"/>
+                <w:szCs w:val="19"/>
+              </w:rPr>
+              <w:t xml:space="preserve">Two small additions from Tilly's 1975 volume</w:t>
+            </w:r>
+          </w:p>
+        </w:tc>
+        <w:tc>
+          <w:tcPr>
+            <w:tcW w:type="dxa" w:w="3000"/>
+            <w:shd w:fill="FFF4D6" w:color="auto" w:val="clear"/>
+            <w:tcMar>
+              <w:top w:type="dxa" w:w="80"/>
+              <w:left w:type="dxa" w:w="100"/>
+              <w:bottom w:type="dxa" w:w="80"/>
+              <w:right w:type="dxa" w:w="100"/>
+            </w:tcMar>
+          </w:tcPr>
+          <w:p>
+            <w:r>
+              <w:rPr>
+                <w:rFonts w:ascii="Georgia" w:cs="Georgia" w:eastAsia="Georgia" w:hAnsi="Georgia"/>
+                <w:sz w:val="19"/>
+                <w:szCs w:val="19"/>
+              </w:rPr>
+              <w:t xml:space="preserve"/>
+            </w:r>
+          </w:p>
+        </w:tc>
+      </w:tr>
     </w:tbl>
     <w:p>
       <w:pPr>

</xml_diff>